<commit_message>
điều chỉnh Đăng nhập KH
</commit_message>
<xml_diff>
--- a/Tai lieu phan tich/01_Website_Khach_hang/Dang nhap khach hang.docx
+++ b/Tai lieu phan tich/01_Website_Khach_hang/Dang nhap khach hang.docx
@@ -1233,19 +1233,6 @@
             <w:r>
               <w:t>.</w:t>
             </w:r>
-            <w:r>
-              <w:br/>
-              <w:t xml:space="preserve">+ </w:t>
-            </w:r>
-            <w:r>
-              <w:rPr>
-                <w:bCs/>
-              </w:rPr>
-              <w:t>TH Hợp lệ (Đăng nhập thành công)</w:t>
-            </w:r>
-            <w:r>
-              <w:t>: Khởi tạo phiên làm việc (Session), ghi nhận nhật ký đăng nhập (Audit Log) và chuyển hướng người dùng về Trang chủ theo đúng phân quyền.</w:t>
-            </w:r>
           </w:p>
         </w:tc>
       </w:tr>
@@ -1649,74 +1636,74 @@
               <w:jc w:val="both"/>
             </w:pPr>
             <w:r>
-              <w:rPr>
-                <w:bCs/>
-              </w:rPr>
+              <w:t>Tên đăng nhập</w:t>
+            </w:r>
+          </w:p>
+        </w:tc>
+        <w:tc>
+          <w:tcPr>
+            <w:tcW w:w="1584" w:type="dxa"/>
+            <w:shd w:val="clear" w:color="auto" w:fill="auto"/>
+          </w:tcPr>
+          <w:p>
+            <w:pPr>
+              <w:spacing w:before="60" w:after="60" w:line="240" w:lineRule="auto"/>
+              <w:jc w:val="both"/>
+            </w:pPr>
+            <w:r>
+              <w:t>String(255)</w:t>
+            </w:r>
+          </w:p>
+        </w:tc>
+        <w:tc>
+          <w:tcPr>
+            <w:tcW w:w="979" w:type="dxa"/>
+            <w:shd w:val="clear" w:color="auto" w:fill="auto"/>
+          </w:tcPr>
+          <w:p>
+            <w:pPr>
+              <w:spacing w:before="60" w:after="60" w:line="240" w:lineRule="auto"/>
+              <w:jc w:val="both"/>
+            </w:pPr>
+            <w:r>
+              <w:t>Có</w:t>
+            </w:r>
+          </w:p>
+        </w:tc>
+        <w:tc>
+          <w:tcPr>
+            <w:tcW w:w="979" w:type="dxa"/>
+            <w:shd w:val="clear" w:color="auto" w:fill="auto"/>
+          </w:tcPr>
+          <w:p>
+            <w:pPr>
+              <w:spacing w:before="60" w:after="60" w:line="240" w:lineRule="auto"/>
+              <w:jc w:val="both"/>
+            </w:pPr>
+            <w:r>
+              <w:t>Trống</w:t>
+            </w:r>
+          </w:p>
+        </w:tc>
+        <w:tc>
+          <w:tcPr>
+            <w:tcW w:w="3773" w:type="dxa"/>
+            <w:shd w:val="clear" w:color="auto" w:fill="auto"/>
+          </w:tcPr>
+          <w:p>
+            <w:pPr>
+              <w:spacing w:before="60" w:after="60" w:line="240" w:lineRule="auto"/>
+            </w:pPr>
+            <w:r>
+              <w:t>Control UI: Ô nhập văn bản (Input text).</w:t>
+            </w:r>
+            <w:r>
+              <w:br/>
+              <w:t xml:space="preserve">- Nhập Tên đăng nhập, Email hoặc Mã số thuế doanh nghiệp </w:t>
+            </w:r>
+            <w:r>
               <w:lastRenderedPageBreak/>
-              <w:t>Tên đăng nhập</w:t>
-            </w:r>
-          </w:p>
-        </w:tc>
-        <w:tc>
-          <w:tcPr>
-            <w:tcW w:w="1584" w:type="dxa"/>
-            <w:shd w:val="clear" w:color="auto" w:fill="auto"/>
-          </w:tcPr>
-          <w:p>
-            <w:pPr>
-              <w:spacing w:before="60" w:after="60" w:line="240" w:lineRule="auto"/>
-              <w:jc w:val="both"/>
-            </w:pPr>
-            <w:r>
-              <w:t>String(255)</w:t>
-            </w:r>
-          </w:p>
-        </w:tc>
-        <w:tc>
-          <w:tcPr>
-            <w:tcW w:w="979" w:type="dxa"/>
-            <w:shd w:val="clear" w:color="auto" w:fill="auto"/>
-          </w:tcPr>
-          <w:p>
-            <w:pPr>
-              <w:spacing w:before="60" w:after="60" w:line="240" w:lineRule="auto"/>
-              <w:jc w:val="both"/>
-            </w:pPr>
-            <w:r>
-              <w:t>Có</w:t>
-            </w:r>
-          </w:p>
-        </w:tc>
-        <w:tc>
-          <w:tcPr>
-            <w:tcW w:w="979" w:type="dxa"/>
-            <w:shd w:val="clear" w:color="auto" w:fill="auto"/>
-          </w:tcPr>
-          <w:p>
-            <w:pPr>
-              <w:spacing w:before="60" w:after="60" w:line="240" w:lineRule="auto"/>
-              <w:jc w:val="both"/>
-            </w:pPr>
-            <w:r>
-              <w:t>Trống</w:t>
-            </w:r>
-          </w:p>
-        </w:tc>
-        <w:tc>
-          <w:tcPr>
-            <w:tcW w:w="3773" w:type="dxa"/>
-            <w:shd w:val="clear" w:color="auto" w:fill="auto"/>
-          </w:tcPr>
-          <w:p>
-            <w:pPr>
-              <w:spacing w:before="60" w:after="60" w:line="240" w:lineRule="auto"/>
-            </w:pPr>
-            <w:r>
-              <w:t>Control UI: Ô nhập văn bản (Input text).</w:t>
-            </w:r>
-            <w:r>
-              <w:br/>
-              <w:t>- Nhập Tên đăng nhập, Email hoặc Mã số thuế doanh nghiệp được cấp.</w:t>
+              <w:t>được cấp.</w:t>
             </w:r>
           </w:p>
         </w:tc>
@@ -1733,9 +1720,7 @@
               <w:jc w:val="both"/>
             </w:pPr>
             <w:r>
-              <w:rPr>
-                <w:bCs/>
-              </w:rPr>
+              <w:lastRenderedPageBreak/>
               <w:t>Mật khẩu tài khoản</w:t>
             </w:r>
           </w:p>
@@ -1816,9 +1801,6 @@
               <w:jc w:val="both"/>
             </w:pPr>
             <w:r>
-              <w:rPr>
-                <w:bCs/>
-              </w:rPr>
               <w:t>Ghi nhớ đăng nhập</w:t>
             </w:r>
           </w:p>
@@ -1899,9 +1881,6 @@
               <w:jc w:val="both"/>
             </w:pPr>
             <w:r>
-              <w:rPr>
-                <w:bCs/>
-              </w:rPr>
               <w:t>Quên mật khẩu?</w:t>
             </w:r>
           </w:p>
@@ -2259,11 +2238,7 @@
               <w:t>[BR-VAL-001]</w:t>
             </w:r>
             <w:r>
-              <w:t xml:space="preserve">. Hệ thống highlight </w:t>
-            </w:r>
-            <w:r>
-              <w:lastRenderedPageBreak/>
-              <w:t xml:space="preserve">viền đỏ ô trống đầu tiên, hiển thị cảnh báo lỗi </w:t>
+              <w:t xml:space="preserve">. Hệ thống highlight viền đỏ ô trống đầu tiên, hiển thị cảnh báo lỗi </w:t>
             </w:r>
             <w:r>
               <w:rPr>
@@ -2289,6 +2264,9 @@
             </w:r>
             <w:r>
               <w:br/>
+            </w:r>
+            <w:r>
+              <w:lastRenderedPageBreak/>
               <w:t xml:space="preserve"> + Tên đăng nhập nhập theo định dạng Email nhưng không đúng chuẩn: Vi phạm quy tắc </w:t>
             </w:r>
             <w:r>
@@ -2423,11 +2401,7 @@
               <w:t>TH6 (Mật khẩu hết hạn)</w:t>
             </w:r>
             <w:r>
-              <w:t xml:space="preserve">: Nếu khoảng thời gian từ lần đổi mật khẩu gần nhất vượt quá </w:t>
-            </w:r>
-            <w:r>
-              <w:lastRenderedPageBreak/>
-              <w:t xml:space="preserve">thời hạn hiệu lực cấu hình tại </w:t>
+              <w:t xml:space="preserve">: Nếu khoảng thời gian từ lần đổi mật khẩu gần nhất vượt quá thời hạn hiệu lực cấu hình tại </w:t>
             </w:r>
             <w:r>
               <w:rPr>
@@ -2447,7 +2421,11 @@
               </w:r>
             </w:hyperlink>
             <w:r>
-              <w:t xml:space="preserve"> kèm thông báo yêu cầu cập nhật mật khẩu đã hết hạn.</w:t>
+              <w:t xml:space="preserve"> kèm thông báo yêu cầu cập nhật mật khẩu </w:t>
+            </w:r>
+            <w:r>
+              <w:lastRenderedPageBreak/>
+              <w:t>đã hết hạn.</w:t>
             </w:r>
             <w:r>
               <w:br/>
@@ -2612,11 +2590,7 @@
               <w:t>TH3 (Hồ sơ tài khoản Bị khóa hoặc Đóng)</w:t>
             </w:r>
             <w:r>
-              <w:t xml:space="preserve">: Nếu tài khoản đang ở trạng thái Bị khóa hoặc Đóng, hệ thống từ chối cấp lại </w:t>
-            </w:r>
-            <w:r>
-              <w:lastRenderedPageBreak/>
-              <w:t xml:space="preserve">mật khẩu và hiển thị </w:t>
+              <w:t xml:space="preserve">: Nếu tài khoản đang ở trạng thái Bị khóa hoặc Đóng, hệ thống từ chối cấp lại mật khẩu và hiển thị </w:t>
             </w:r>
             <w:r>
               <w:rPr>
@@ -2642,7 +2616,11 @@
             </w:r>
             <w:r>
               <w:br/>
-              <w:t xml:space="preserve"> + Hệ thống tự động tạo mật khẩu tạm thời ngẫu nhiên mới đáp ứng quy chuẩn độ phức tạp </w:t>
+              <w:t xml:space="preserve"> + Hệ thống tự động tạo mật khẩu tạm thời ngẫu nhiên mới đáp ứng quy chuẩn độ phức </w:t>
+            </w:r>
+            <w:r>
+              <w:lastRenderedPageBreak/>
+              <w:t xml:space="preserve">tạp </w:t>
             </w:r>
             <w:r>
               <w:rPr>
@@ -3017,7 +2995,7 @@
                 <w:b/>
                 <w:bCs/>
               </w:rPr>
-              <w:t>I. Nhu cầu sử dụng tài khoản</w:t>
+              <w:t>I. Thông tin chung</w:t>
             </w:r>
           </w:p>
         </w:tc>
@@ -3034,11 +3012,172 @@
               <w:jc w:val="both"/>
             </w:pPr>
             <w:r>
-              <w:t xml:space="preserve">Ngữ cảnh đăng </w:t>
+              <w:t>Tài khoản đăng ký</w:t>
+            </w:r>
+          </w:p>
+        </w:tc>
+        <w:tc>
+          <w:tcPr>
+            <w:tcW w:w="1584" w:type="dxa"/>
+            <w:shd w:val="clear" w:color="auto" w:fill="auto"/>
+          </w:tcPr>
+          <w:p>
+            <w:pPr>
+              <w:spacing w:before="60" w:after="60" w:line="240" w:lineRule="auto"/>
+              <w:jc w:val="both"/>
+            </w:pPr>
+            <w:r>
+              <w:t>Boolean</w:t>
+            </w:r>
+          </w:p>
+        </w:tc>
+        <w:tc>
+          <w:tcPr>
+            <w:tcW w:w="979" w:type="dxa"/>
+            <w:shd w:val="clear" w:color="auto" w:fill="auto"/>
+          </w:tcPr>
+          <w:p>
+            <w:pPr>
+              <w:spacing w:before="60" w:after="60" w:line="240" w:lineRule="auto"/>
+              <w:jc w:val="both"/>
+            </w:pPr>
+            <w:r>
+              <w:t>Không</w:t>
+            </w:r>
+          </w:p>
+        </w:tc>
+        <w:tc>
+          <w:tcPr>
+            <w:tcW w:w="979" w:type="dxa"/>
+            <w:shd w:val="clear" w:color="auto" w:fill="auto"/>
+          </w:tcPr>
+          <w:p>
+            <w:pPr>
+              <w:spacing w:before="60" w:after="60" w:line="240" w:lineRule="auto"/>
+              <w:jc w:val="both"/>
+            </w:pPr>
+            <w:r>
+              <w:t>Uncheck</w:t>
+            </w:r>
+          </w:p>
+        </w:tc>
+        <w:tc>
+          <w:tcPr>
+            <w:tcW w:w="3773" w:type="dxa"/>
+            <w:shd w:val="clear" w:color="auto" w:fill="auto"/>
+          </w:tcPr>
+          <w:p>
+            <w:pPr>
+              <w:spacing w:before="60" w:after="60" w:line="240" w:lineRule="auto"/>
+            </w:pPr>
+            <w:r>
+              <w:t>Control UI: Checkbox.</w:t>
+            </w:r>
+            <w:r>
+              <w:br/>
+              <w:t>- Chọn nhu cầu sử dụng nhóm chức năng đăng ký BPBĐ.</w:t>
+            </w:r>
+          </w:p>
+        </w:tc>
+      </w:tr>
+      <w:tr>
+        <w:tc>
+          <w:tcPr>
+            <w:tcW w:w="2362" w:type="dxa"/>
+            <w:shd w:val="clear" w:color="auto" w:fill="auto"/>
+          </w:tcPr>
+          <w:p>
+            <w:pPr>
+              <w:spacing w:before="60" w:after="60" w:line="240" w:lineRule="auto"/>
+              <w:jc w:val="both"/>
+            </w:pPr>
+            <w:r>
+              <w:t>Tài khoản tra cứu</w:t>
+            </w:r>
+          </w:p>
+        </w:tc>
+        <w:tc>
+          <w:tcPr>
+            <w:tcW w:w="1584" w:type="dxa"/>
+            <w:shd w:val="clear" w:color="auto" w:fill="auto"/>
+          </w:tcPr>
+          <w:p>
+            <w:pPr>
+              <w:spacing w:before="60" w:after="60" w:line="240" w:lineRule="auto"/>
+              <w:jc w:val="both"/>
+            </w:pPr>
+            <w:r>
+              <w:t>Boolean</w:t>
+            </w:r>
+          </w:p>
+        </w:tc>
+        <w:tc>
+          <w:tcPr>
+            <w:tcW w:w="979" w:type="dxa"/>
+            <w:shd w:val="clear" w:color="auto" w:fill="auto"/>
+          </w:tcPr>
+          <w:p>
+            <w:pPr>
+              <w:spacing w:before="60" w:after="60" w:line="240" w:lineRule="auto"/>
+              <w:jc w:val="both"/>
+            </w:pPr>
+            <w:r>
+              <w:t>Không</w:t>
+            </w:r>
+          </w:p>
+        </w:tc>
+        <w:tc>
+          <w:tcPr>
+            <w:tcW w:w="979" w:type="dxa"/>
+            <w:shd w:val="clear" w:color="auto" w:fill="auto"/>
+          </w:tcPr>
+          <w:p>
+            <w:pPr>
+              <w:spacing w:before="60" w:after="60" w:line="240" w:lineRule="auto"/>
+              <w:jc w:val="both"/>
+            </w:pPr>
+            <w:r>
+              <w:t>Uncheck</w:t>
+            </w:r>
+          </w:p>
+        </w:tc>
+        <w:tc>
+          <w:tcPr>
+            <w:tcW w:w="3773" w:type="dxa"/>
+            <w:shd w:val="clear" w:color="auto" w:fill="auto"/>
+          </w:tcPr>
+          <w:p>
+            <w:pPr>
+              <w:spacing w:before="60" w:after="60" w:line="240" w:lineRule="auto"/>
+            </w:pPr>
+            <w:r>
+              <w:t>Control UI: Checkbox.</w:t>
+            </w:r>
+            <w:r>
+              <w:br/>
+              <w:t xml:space="preserve">- Chọn nhu cầu sử dụng nhóm chức năng tra cứu/cấp mã số sử </w:t>
             </w:r>
             <w:r>
               <w:lastRenderedPageBreak/>
-              <w:t>nhập</w:t>
+              <w:t>dụng CSDL.</w:t>
+            </w:r>
+          </w:p>
+        </w:tc>
+      </w:tr>
+      <w:tr>
+        <w:tc>
+          <w:tcPr>
+            <w:tcW w:w="2362" w:type="dxa"/>
+            <w:shd w:val="clear" w:color="auto" w:fill="auto"/>
+          </w:tcPr>
+          <w:p>
+            <w:pPr>
+              <w:spacing w:before="60" w:after="60" w:line="240" w:lineRule="auto"/>
+              <w:jc w:val="both"/>
+            </w:pPr>
+            <w:r>
+              <w:lastRenderedPageBreak/>
+              <w:t>Thiết lập đăng nhập bằng Email/Mật khẩu</w:t>
             </w:r>
           </w:p>
         </w:tc>
@@ -3053,7 +3192,773 @@
               <w:jc w:val="both"/>
             </w:pPr>
             <w:r>
-              <w:lastRenderedPageBreak/>
+              <w:t>Boolean</w:t>
+            </w:r>
+          </w:p>
+        </w:tc>
+        <w:tc>
+          <w:tcPr>
+            <w:tcW w:w="979" w:type="dxa"/>
+            <w:shd w:val="clear" w:color="auto" w:fill="auto"/>
+          </w:tcPr>
+          <w:p>
+            <w:pPr>
+              <w:spacing w:before="60" w:after="60" w:line="240" w:lineRule="auto"/>
+              <w:jc w:val="both"/>
+            </w:pPr>
+            <w:r>
+              <w:t>Không</w:t>
+            </w:r>
+          </w:p>
+        </w:tc>
+        <w:tc>
+          <w:tcPr>
+            <w:tcW w:w="979" w:type="dxa"/>
+            <w:shd w:val="clear" w:color="auto" w:fill="auto"/>
+          </w:tcPr>
+          <w:p>
+            <w:pPr>
+              <w:spacing w:before="60" w:after="60" w:line="240" w:lineRule="auto"/>
+              <w:jc w:val="both"/>
+            </w:pPr>
+            <w:r>
+              <w:t>Uncheck</w:t>
+            </w:r>
+          </w:p>
+        </w:tc>
+        <w:tc>
+          <w:tcPr>
+            <w:tcW w:w="3773" w:type="dxa"/>
+            <w:shd w:val="clear" w:color="auto" w:fill="auto"/>
+          </w:tcPr>
+          <w:p>
+            <w:pPr>
+              <w:spacing w:before="60" w:after="60" w:line="240" w:lineRule="auto"/>
+            </w:pPr>
+            <w:r>
+              <w:t>Control UI: Checkbox.</w:t>
+            </w:r>
+            <w:r>
+              <w:br/>
+              <w:t>- Nếu tích chọn: hiển thị các trường nhập Email và Mật khẩu trên form.</w:t>
+            </w:r>
+          </w:p>
+        </w:tc>
+      </w:tr>
+      <w:tr>
+        <w:tc>
+          <w:tcPr>
+            <w:tcW w:w="2362" w:type="dxa"/>
+            <w:shd w:val="clear" w:color="auto" w:fill="auto"/>
+          </w:tcPr>
+          <w:p>
+            <w:pPr>
+              <w:spacing w:before="60" w:after="60" w:line="240" w:lineRule="auto"/>
+              <w:jc w:val="both"/>
+            </w:pPr>
+            <w:r>
+              <w:rPr>
+                <w:bCs/>
+              </w:rPr>
+              <w:t>II. Thông tin Cá nhân</w:t>
+            </w:r>
+          </w:p>
+        </w:tc>
+        <w:tc>
+          <w:tcPr>
+            <w:tcW w:w="1584" w:type="dxa"/>
+            <w:shd w:val="clear" w:color="auto" w:fill="auto"/>
+          </w:tcPr>
+          <w:p>
+            <w:pPr>
+              <w:spacing w:before="60" w:after="60" w:line="240" w:lineRule="auto"/>
+              <w:jc w:val="both"/>
+            </w:pPr>
+          </w:p>
+        </w:tc>
+        <w:tc>
+          <w:tcPr>
+            <w:tcW w:w="979" w:type="dxa"/>
+            <w:shd w:val="clear" w:color="auto" w:fill="auto"/>
+          </w:tcPr>
+          <w:p>
+            <w:pPr>
+              <w:spacing w:before="60" w:after="60" w:line="240" w:lineRule="auto"/>
+              <w:jc w:val="both"/>
+            </w:pPr>
+          </w:p>
+        </w:tc>
+        <w:tc>
+          <w:tcPr>
+            <w:tcW w:w="979" w:type="dxa"/>
+            <w:shd w:val="clear" w:color="auto" w:fill="auto"/>
+          </w:tcPr>
+          <w:p>
+            <w:pPr>
+              <w:spacing w:before="60" w:after="60" w:line="240" w:lineRule="auto"/>
+              <w:jc w:val="both"/>
+            </w:pPr>
+          </w:p>
+        </w:tc>
+        <w:tc>
+          <w:tcPr>
+            <w:tcW w:w="3773" w:type="dxa"/>
+            <w:shd w:val="clear" w:color="auto" w:fill="auto"/>
+          </w:tcPr>
+          <w:p>
+            <w:pPr>
+              <w:spacing w:before="60" w:after="60" w:line="240" w:lineRule="auto"/>
+              <w:jc w:val="both"/>
+            </w:pPr>
+            <w:r>
+              <w:t>Chỉ hiển thị khi loại chủ thể là Cá nhân.</w:t>
+            </w:r>
+          </w:p>
+        </w:tc>
+      </w:tr>
+      <w:tr>
+        <w:tc>
+          <w:tcPr>
+            <w:tcW w:w="2362" w:type="dxa"/>
+            <w:shd w:val="clear" w:color="auto" w:fill="auto"/>
+          </w:tcPr>
+          <w:p>
+            <w:pPr>
+              <w:spacing w:before="60" w:after="60" w:line="240" w:lineRule="auto"/>
+              <w:jc w:val="both"/>
+            </w:pPr>
+            <w:r>
+              <w:t>Loại tài khoản</w:t>
+            </w:r>
+          </w:p>
+        </w:tc>
+        <w:tc>
+          <w:tcPr>
+            <w:tcW w:w="1584" w:type="dxa"/>
+            <w:shd w:val="clear" w:color="auto" w:fill="auto"/>
+          </w:tcPr>
+          <w:p>
+            <w:pPr>
+              <w:spacing w:before="60" w:after="60" w:line="240" w:lineRule="auto"/>
+              <w:jc w:val="both"/>
+            </w:pPr>
+            <w:r>
+              <w:t>Enum(String(50))</w:t>
+            </w:r>
+          </w:p>
+        </w:tc>
+        <w:tc>
+          <w:tcPr>
+            <w:tcW w:w="979" w:type="dxa"/>
+            <w:shd w:val="clear" w:color="auto" w:fill="auto"/>
+          </w:tcPr>
+          <w:p>
+            <w:pPr>
+              <w:spacing w:before="60" w:after="60" w:line="240" w:lineRule="auto"/>
+              <w:jc w:val="both"/>
+            </w:pPr>
+            <w:r>
+              <w:t>Có</w:t>
+            </w:r>
+          </w:p>
+        </w:tc>
+        <w:tc>
+          <w:tcPr>
+            <w:tcW w:w="979" w:type="dxa"/>
+            <w:shd w:val="clear" w:color="auto" w:fill="auto"/>
+          </w:tcPr>
+          <w:p>
+            <w:pPr>
+              <w:spacing w:before="60" w:after="60" w:line="240" w:lineRule="auto"/>
+              <w:jc w:val="both"/>
+            </w:pPr>
+            <w:r>
+              <w:t>Cá nhân</w:t>
+            </w:r>
+          </w:p>
+        </w:tc>
+        <w:tc>
+          <w:tcPr>
+            <w:tcW w:w="3773" w:type="dxa"/>
+            <w:shd w:val="clear" w:color="auto" w:fill="auto"/>
+          </w:tcPr>
+          <w:p>
+            <w:pPr>
+              <w:spacing w:before="60" w:after="60" w:line="240" w:lineRule="auto"/>
+              <w:jc w:val="both"/>
+            </w:pPr>
+            <w:r>
+              <w:t>Chỉ đọc.</w:t>
+            </w:r>
+          </w:p>
+        </w:tc>
+      </w:tr>
+      <w:tr>
+        <w:tc>
+          <w:tcPr>
+            <w:tcW w:w="2362" w:type="dxa"/>
+            <w:shd w:val="clear" w:color="auto" w:fill="auto"/>
+          </w:tcPr>
+          <w:p>
+            <w:pPr>
+              <w:spacing w:before="60" w:after="60" w:line="240" w:lineRule="auto"/>
+              <w:jc w:val="both"/>
+            </w:pPr>
+            <w:r>
+              <w:t>Email (Tên đăng nhập)</w:t>
+            </w:r>
+          </w:p>
+        </w:tc>
+        <w:tc>
+          <w:tcPr>
+            <w:tcW w:w="1584" w:type="dxa"/>
+            <w:shd w:val="clear" w:color="auto" w:fill="auto"/>
+          </w:tcPr>
+          <w:p>
+            <w:pPr>
+              <w:spacing w:before="60" w:after="60" w:line="240" w:lineRule="auto"/>
+              <w:jc w:val="both"/>
+            </w:pPr>
+            <w:r>
+              <w:t>String(255)</w:t>
+            </w:r>
+          </w:p>
+        </w:tc>
+        <w:tc>
+          <w:tcPr>
+            <w:tcW w:w="979" w:type="dxa"/>
+            <w:shd w:val="clear" w:color="auto" w:fill="auto"/>
+          </w:tcPr>
+          <w:p>
+            <w:pPr>
+              <w:spacing w:before="60" w:after="60" w:line="240" w:lineRule="auto"/>
+              <w:jc w:val="both"/>
+            </w:pPr>
+            <w:r>
+              <w:t>Có điều kiện</w:t>
+            </w:r>
+          </w:p>
+        </w:tc>
+        <w:tc>
+          <w:tcPr>
+            <w:tcW w:w="979" w:type="dxa"/>
+            <w:shd w:val="clear" w:color="auto" w:fill="auto"/>
+          </w:tcPr>
+          <w:p>
+            <w:pPr>
+              <w:spacing w:before="60" w:after="60" w:line="240" w:lineRule="auto"/>
+              <w:jc w:val="both"/>
+            </w:pPr>
+            <w:r>
+              <w:t>Theo Email VNeID nếu có</w:t>
+            </w:r>
+          </w:p>
+        </w:tc>
+        <w:tc>
+          <w:tcPr>
+            <w:tcW w:w="3773" w:type="dxa"/>
+            <w:shd w:val="clear" w:color="auto" w:fill="auto"/>
+          </w:tcPr>
+          <w:p>
+            <w:pPr>
+              <w:spacing w:before="60" w:after="60" w:line="240" w:lineRule="auto"/>
+              <w:jc w:val="both"/>
+            </w:pPr>
+            <w:r>
+              <w:t>Chỉ hiển thị và bắt buộc khi chọn “Thiết lập đăng nhập bằng Email/Mật khẩu”. Áp dụng [BR-VAL-002] và [BR-VAL-009].</w:t>
+            </w:r>
+          </w:p>
+        </w:tc>
+      </w:tr>
+      <w:tr>
+        <w:tc>
+          <w:tcPr>
+            <w:tcW w:w="2362" w:type="dxa"/>
+            <w:shd w:val="clear" w:color="auto" w:fill="auto"/>
+          </w:tcPr>
+          <w:p>
+            <w:pPr>
+              <w:spacing w:before="60" w:after="60" w:line="240" w:lineRule="auto"/>
+              <w:jc w:val="both"/>
+            </w:pPr>
+            <w:r>
+              <w:t>Mật khẩu đăng nhập</w:t>
+            </w:r>
+          </w:p>
+        </w:tc>
+        <w:tc>
+          <w:tcPr>
+            <w:tcW w:w="1584" w:type="dxa"/>
+            <w:shd w:val="clear" w:color="auto" w:fill="auto"/>
+          </w:tcPr>
+          <w:p>
+            <w:pPr>
+              <w:spacing w:before="60" w:after="60" w:line="240" w:lineRule="auto"/>
+              <w:jc w:val="both"/>
+            </w:pPr>
+            <w:r>
+              <w:t>Password</w:t>
+            </w:r>
+          </w:p>
+        </w:tc>
+        <w:tc>
+          <w:tcPr>
+            <w:tcW w:w="979" w:type="dxa"/>
+            <w:shd w:val="clear" w:color="auto" w:fill="auto"/>
+          </w:tcPr>
+          <w:p>
+            <w:pPr>
+              <w:spacing w:before="60" w:after="60" w:line="240" w:lineRule="auto"/>
+              <w:jc w:val="both"/>
+            </w:pPr>
+            <w:r>
+              <w:t>Có điều kiện</w:t>
+            </w:r>
+          </w:p>
+        </w:tc>
+        <w:tc>
+          <w:tcPr>
+            <w:tcW w:w="979" w:type="dxa"/>
+            <w:shd w:val="clear" w:color="auto" w:fill="auto"/>
+          </w:tcPr>
+          <w:p>
+            <w:pPr>
+              <w:spacing w:before="60" w:after="60" w:line="240" w:lineRule="auto"/>
+              <w:jc w:val="both"/>
+            </w:pPr>
+            <w:r>
+              <w:t>Trống</w:t>
+            </w:r>
+          </w:p>
+        </w:tc>
+        <w:tc>
+          <w:tcPr>
+            <w:tcW w:w="3773" w:type="dxa"/>
+            <w:shd w:val="clear" w:color="auto" w:fill="auto"/>
+          </w:tcPr>
+          <w:p>
+            <w:pPr>
+              <w:spacing w:before="60" w:after="60" w:line="240" w:lineRule="auto"/>
+              <w:jc w:val="both"/>
+            </w:pPr>
+            <w:r>
+              <w:t>Chỉ hiển thị và bắt buộc khi chọn “Thiết lập đăng nhập bằng Email/Mật khẩu”. Áp dụng [BR-VAL-006].</w:t>
+            </w:r>
+          </w:p>
+        </w:tc>
+      </w:tr>
+      <w:tr>
+        <w:tc>
+          <w:tcPr>
+            <w:tcW w:w="2362" w:type="dxa"/>
+            <w:shd w:val="clear" w:color="auto" w:fill="auto"/>
+          </w:tcPr>
+          <w:p>
+            <w:pPr>
+              <w:spacing w:before="60" w:after="60" w:line="240" w:lineRule="auto"/>
+              <w:jc w:val="both"/>
+            </w:pPr>
+            <w:r>
+              <w:t>Nhập lại mật khẩu</w:t>
+            </w:r>
+          </w:p>
+        </w:tc>
+        <w:tc>
+          <w:tcPr>
+            <w:tcW w:w="1584" w:type="dxa"/>
+            <w:shd w:val="clear" w:color="auto" w:fill="auto"/>
+          </w:tcPr>
+          <w:p>
+            <w:pPr>
+              <w:spacing w:before="60" w:after="60" w:line="240" w:lineRule="auto"/>
+              <w:jc w:val="both"/>
+            </w:pPr>
+            <w:r>
+              <w:t>Password</w:t>
+            </w:r>
+          </w:p>
+        </w:tc>
+        <w:tc>
+          <w:tcPr>
+            <w:tcW w:w="979" w:type="dxa"/>
+            <w:shd w:val="clear" w:color="auto" w:fill="auto"/>
+          </w:tcPr>
+          <w:p>
+            <w:pPr>
+              <w:spacing w:before="60" w:after="60" w:line="240" w:lineRule="auto"/>
+              <w:jc w:val="both"/>
+            </w:pPr>
+            <w:r>
+              <w:t>Có điều kiện</w:t>
+            </w:r>
+          </w:p>
+        </w:tc>
+        <w:tc>
+          <w:tcPr>
+            <w:tcW w:w="979" w:type="dxa"/>
+            <w:shd w:val="clear" w:color="auto" w:fill="auto"/>
+          </w:tcPr>
+          <w:p>
+            <w:pPr>
+              <w:spacing w:before="60" w:after="60" w:line="240" w:lineRule="auto"/>
+              <w:jc w:val="both"/>
+            </w:pPr>
+            <w:r>
+              <w:t>Trống</w:t>
+            </w:r>
+          </w:p>
+        </w:tc>
+        <w:tc>
+          <w:tcPr>
+            <w:tcW w:w="3773" w:type="dxa"/>
+            <w:shd w:val="clear" w:color="auto" w:fill="auto"/>
+          </w:tcPr>
+          <w:p>
+            <w:pPr>
+              <w:spacing w:before="60" w:after="60" w:line="240" w:lineRule="auto"/>
+              <w:jc w:val="both"/>
+            </w:pPr>
+            <w:r>
+              <w:t>Chỉ hiển thị và bắt buộc khi chọn “Thiết lập đăng nhập bằng Email/Mật khẩu”.</w:t>
+            </w:r>
+          </w:p>
+        </w:tc>
+      </w:tr>
+      <w:tr>
+        <w:tc>
+          <w:tcPr>
+            <w:tcW w:w="2362" w:type="dxa"/>
+            <w:shd w:val="clear" w:color="auto" w:fill="auto"/>
+          </w:tcPr>
+          <w:p>
+            <w:pPr>
+              <w:spacing w:before="60" w:after="60" w:line="240" w:lineRule="auto"/>
+              <w:jc w:val="both"/>
+            </w:pPr>
+            <w:r>
+              <w:t>Loại giấy tờ</w:t>
+            </w:r>
+          </w:p>
+        </w:tc>
+        <w:tc>
+          <w:tcPr>
+            <w:tcW w:w="1584" w:type="dxa"/>
+            <w:shd w:val="clear" w:color="auto" w:fill="auto"/>
+          </w:tcPr>
+          <w:p>
+            <w:pPr>
+              <w:spacing w:before="60" w:after="60" w:line="240" w:lineRule="auto"/>
+              <w:jc w:val="both"/>
+            </w:pPr>
+            <w:r>
+              <w:t>Enum(String(50))</w:t>
+            </w:r>
+          </w:p>
+        </w:tc>
+        <w:tc>
+          <w:tcPr>
+            <w:tcW w:w="979" w:type="dxa"/>
+            <w:shd w:val="clear" w:color="auto" w:fill="auto"/>
+          </w:tcPr>
+          <w:p>
+            <w:pPr>
+              <w:spacing w:before="60" w:after="60" w:line="240" w:lineRule="auto"/>
+              <w:jc w:val="both"/>
+            </w:pPr>
+            <w:r>
+              <w:t>Có</w:t>
+            </w:r>
+          </w:p>
+        </w:tc>
+        <w:tc>
+          <w:tcPr>
+            <w:tcW w:w="979" w:type="dxa"/>
+            <w:shd w:val="clear" w:color="auto" w:fill="auto"/>
+          </w:tcPr>
+          <w:p>
+            <w:pPr>
+              <w:spacing w:before="60" w:after="60" w:line="240" w:lineRule="auto"/>
+              <w:jc w:val="both"/>
+            </w:pPr>
+            <w:r>
+              <w:t>Lấy từ VNeID</w:t>
+            </w:r>
+          </w:p>
+        </w:tc>
+        <w:tc>
+          <w:tcPr>
+            <w:tcW w:w="3773" w:type="dxa"/>
+            <w:shd w:val="clear" w:color="auto" w:fill="auto"/>
+          </w:tcPr>
+          <w:p>
+            <w:pPr>
+              <w:spacing w:before="60" w:after="60" w:line="240" w:lineRule="auto"/>
+              <w:jc w:val="both"/>
+            </w:pPr>
+            <w:r>
+              <w:t>Chỉ đọc.</w:t>
+            </w:r>
+          </w:p>
+        </w:tc>
+      </w:tr>
+      <w:tr>
+        <w:tc>
+          <w:tcPr>
+            <w:tcW w:w="2362" w:type="dxa"/>
+            <w:shd w:val="clear" w:color="auto" w:fill="auto"/>
+          </w:tcPr>
+          <w:p>
+            <w:pPr>
+              <w:spacing w:before="60" w:after="60" w:line="240" w:lineRule="auto"/>
+              <w:jc w:val="both"/>
+            </w:pPr>
+            <w:r>
+              <w:t>Số giấy tờ</w:t>
+            </w:r>
+          </w:p>
+        </w:tc>
+        <w:tc>
+          <w:tcPr>
+            <w:tcW w:w="1584" w:type="dxa"/>
+            <w:shd w:val="clear" w:color="auto" w:fill="auto"/>
+          </w:tcPr>
+          <w:p>
+            <w:pPr>
+              <w:spacing w:before="60" w:after="60" w:line="240" w:lineRule="auto"/>
+              <w:jc w:val="both"/>
+            </w:pPr>
+            <w:r>
+              <w:t>String(255)</w:t>
+            </w:r>
+          </w:p>
+        </w:tc>
+        <w:tc>
+          <w:tcPr>
+            <w:tcW w:w="979" w:type="dxa"/>
+            <w:shd w:val="clear" w:color="auto" w:fill="auto"/>
+          </w:tcPr>
+          <w:p>
+            <w:pPr>
+              <w:spacing w:before="60" w:after="60" w:line="240" w:lineRule="auto"/>
+              <w:jc w:val="both"/>
+            </w:pPr>
+            <w:r>
+              <w:t>Có</w:t>
+            </w:r>
+          </w:p>
+        </w:tc>
+        <w:tc>
+          <w:tcPr>
+            <w:tcW w:w="979" w:type="dxa"/>
+            <w:shd w:val="clear" w:color="auto" w:fill="auto"/>
+          </w:tcPr>
+          <w:p>
+            <w:pPr>
+              <w:spacing w:before="60" w:after="60" w:line="240" w:lineRule="auto"/>
+              <w:jc w:val="both"/>
+            </w:pPr>
+            <w:r>
+              <w:t>Lấy từ VNeID</w:t>
+            </w:r>
+          </w:p>
+        </w:tc>
+        <w:tc>
+          <w:tcPr>
+            <w:tcW w:w="3773" w:type="dxa"/>
+            <w:shd w:val="clear" w:color="auto" w:fill="auto"/>
+          </w:tcPr>
+          <w:p>
+            <w:pPr>
+              <w:spacing w:before="60" w:after="60" w:line="240" w:lineRule="auto"/>
+              <w:jc w:val="both"/>
+            </w:pPr>
+            <w:r>
+              <w:t>Chỉ đọc.</w:t>
+            </w:r>
+          </w:p>
+        </w:tc>
+      </w:tr>
+      <w:tr>
+        <w:tc>
+          <w:tcPr>
+            <w:tcW w:w="2362" w:type="dxa"/>
+            <w:shd w:val="clear" w:color="auto" w:fill="auto"/>
+          </w:tcPr>
+          <w:p>
+            <w:pPr>
+              <w:spacing w:before="60" w:after="60" w:line="240" w:lineRule="auto"/>
+              <w:jc w:val="both"/>
+            </w:pPr>
+            <w:r>
+              <w:t>Họ và tên</w:t>
+            </w:r>
+          </w:p>
+        </w:tc>
+        <w:tc>
+          <w:tcPr>
+            <w:tcW w:w="1584" w:type="dxa"/>
+            <w:shd w:val="clear" w:color="auto" w:fill="auto"/>
+          </w:tcPr>
+          <w:p>
+            <w:pPr>
+              <w:spacing w:before="60" w:after="60" w:line="240" w:lineRule="auto"/>
+              <w:jc w:val="both"/>
+            </w:pPr>
+            <w:r>
+              <w:t>String(255)</w:t>
+            </w:r>
+          </w:p>
+        </w:tc>
+        <w:tc>
+          <w:tcPr>
+            <w:tcW w:w="979" w:type="dxa"/>
+            <w:shd w:val="clear" w:color="auto" w:fill="auto"/>
+          </w:tcPr>
+          <w:p>
+            <w:pPr>
+              <w:spacing w:before="60" w:after="60" w:line="240" w:lineRule="auto"/>
+              <w:jc w:val="both"/>
+            </w:pPr>
+            <w:r>
+              <w:t>Có</w:t>
+            </w:r>
+          </w:p>
+        </w:tc>
+        <w:tc>
+          <w:tcPr>
+            <w:tcW w:w="979" w:type="dxa"/>
+            <w:shd w:val="clear" w:color="auto" w:fill="auto"/>
+          </w:tcPr>
+          <w:p>
+            <w:pPr>
+              <w:spacing w:before="60" w:after="60" w:line="240" w:lineRule="auto"/>
+              <w:jc w:val="both"/>
+            </w:pPr>
+            <w:r>
+              <w:t>Lấy từ VNeID</w:t>
+            </w:r>
+          </w:p>
+        </w:tc>
+        <w:tc>
+          <w:tcPr>
+            <w:tcW w:w="3773" w:type="dxa"/>
+            <w:shd w:val="clear" w:color="auto" w:fill="auto"/>
+          </w:tcPr>
+          <w:p>
+            <w:pPr>
+              <w:spacing w:before="60" w:after="60" w:line="240" w:lineRule="auto"/>
+              <w:jc w:val="both"/>
+            </w:pPr>
+            <w:r>
+              <w:t>Chỉ đọc.</w:t>
+            </w:r>
+          </w:p>
+        </w:tc>
+      </w:tr>
+      <w:tr>
+        <w:tc>
+          <w:tcPr>
+            <w:tcW w:w="2362" w:type="dxa"/>
+            <w:shd w:val="clear" w:color="auto" w:fill="auto"/>
+          </w:tcPr>
+          <w:p>
+            <w:pPr>
+              <w:spacing w:before="60" w:after="60" w:line="240" w:lineRule="auto"/>
+              <w:jc w:val="both"/>
+            </w:pPr>
+            <w:r>
+              <w:t>Ngày sinh</w:t>
+            </w:r>
+          </w:p>
+        </w:tc>
+        <w:tc>
+          <w:tcPr>
+            <w:tcW w:w="1584" w:type="dxa"/>
+            <w:shd w:val="clear" w:color="auto" w:fill="auto"/>
+          </w:tcPr>
+          <w:p>
+            <w:pPr>
+              <w:spacing w:before="60" w:after="60" w:line="240" w:lineRule="auto"/>
+              <w:jc w:val="both"/>
+            </w:pPr>
+            <w:r>
+              <w:t>Date</w:t>
+            </w:r>
+          </w:p>
+        </w:tc>
+        <w:tc>
+          <w:tcPr>
+            <w:tcW w:w="979" w:type="dxa"/>
+            <w:shd w:val="clear" w:color="auto" w:fill="auto"/>
+          </w:tcPr>
+          <w:p>
+            <w:pPr>
+              <w:spacing w:before="60" w:after="60" w:line="240" w:lineRule="auto"/>
+              <w:jc w:val="both"/>
+            </w:pPr>
+            <w:r>
+              <w:t>Không</w:t>
+            </w:r>
+          </w:p>
+        </w:tc>
+        <w:tc>
+          <w:tcPr>
+            <w:tcW w:w="979" w:type="dxa"/>
+            <w:shd w:val="clear" w:color="auto" w:fill="auto"/>
+          </w:tcPr>
+          <w:p>
+            <w:pPr>
+              <w:spacing w:before="60" w:after="60" w:line="240" w:lineRule="auto"/>
+              <w:jc w:val="both"/>
+            </w:pPr>
+            <w:r>
+              <w:t>Lấy từ VNeID</w:t>
+            </w:r>
+          </w:p>
+        </w:tc>
+        <w:tc>
+          <w:tcPr>
+            <w:tcW w:w="3773" w:type="dxa"/>
+            <w:shd w:val="clear" w:color="auto" w:fill="auto"/>
+          </w:tcPr>
+          <w:p>
+            <w:pPr>
+              <w:spacing w:before="60" w:after="60" w:line="240" w:lineRule="auto"/>
+              <w:jc w:val="both"/>
+            </w:pPr>
+            <w:r>
+              <w:t>Lấy từ VNeID nếu có, cho phép nhập nếu trống.</w:t>
+            </w:r>
+          </w:p>
+        </w:tc>
+      </w:tr>
+      <w:tr>
+        <w:tc>
+          <w:tcPr>
+            <w:tcW w:w="2362" w:type="dxa"/>
+            <w:shd w:val="clear" w:color="auto" w:fill="auto"/>
+          </w:tcPr>
+          <w:p>
+            <w:pPr>
+              <w:spacing w:before="60" w:after="60" w:line="240" w:lineRule="auto"/>
+              <w:jc w:val="both"/>
+            </w:pPr>
+            <w:r>
+              <w:t>Giới tính</w:t>
+            </w:r>
+          </w:p>
+        </w:tc>
+        <w:tc>
+          <w:tcPr>
+            <w:tcW w:w="1584" w:type="dxa"/>
+            <w:shd w:val="clear" w:color="auto" w:fill="auto"/>
+          </w:tcPr>
+          <w:p>
+            <w:pPr>
+              <w:spacing w:before="60" w:after="60" w:line="240" w:lineRule="auto"/>
+              <w:jc w:val="both"/>
+            </w:pPr>
+            <w:r>
               <w:t>Enum(String</w:t>
             </w:r>
             <w:r>
@@ -3074,7 +3979,7 @@
             </w:pPr>
             <w:r>
               <w:lastRenderedPageBreak/>
-              <w:t>Có</w:t>
+              <w:t>Không</w:t>
             </w:r>
           </w:p>
         </w:tc>
@@ -3089,11 +3994,11 @@
               <w:jc w:val="both"/>
             </w:pPr>
             <w:r>
-              <w:t>Theo VNeI</w:t>
+              <w:t xml:space="preserve">Lấy từ </w:t>
             </w:r>
             <w:r>
               <w:lastRenderedPageBreak/>
-              <w:t>D/DVCQG</w:t>
+              <w:t>VNeID</w:t>
             </w:r>
           </w:p>
         </w:tc>
@@ -3109,11 +4014,11 @@
             </w:pPr>
             <w:r>
               <w:lastRenderedPageBreak/>
-              <w:t xml:space="preserve">Chỉ đọc. Gồm: Cá nhân, Tổ chức, </w:t>
+              <w:t xml:space="preserve">Lấy từ VNeID nếu có, cho phép </w:t>
             </w:r>
             <w:r>
               <w:lastRenderedPageBreak/>
-              <w:t>Đại diện tổ chức.</w:t>
+              <w:t>chọn nếu trống.</w:t>
             </w:r>
           </w:p>
         </w:tc>
@@ -3131,7 +4036,7 @@
             </w:pPr>
             <w:r>
               <w:lastRenderedPageBreak/>
-              <w:t>Tài khoản đăng ký</w:t>
+              <w:t>Quốc tịch</w:t>
             </w:r>
           </w:p>
         </w:tc>
@@ -3146,7 +4051,7 @@
               <w:jc w:val="both"/>
             </w:pPr>
             <w:r>
-              <w:t>Boolean</w:t>
+              <w:t>Enum(String(100))</w:t>
             </w:r>
           </w:p>
         </w:tc>
@@ -3161,7 +4066,7 @@
               <w:jc w:val="both"/>
             </w:pPr>
             <w:r>
-              <w:t>Không</w:t>
+              <w:t>Có</w:t>
             </w:r>
           </w:p>
         </w:tc>
@@ -3176,7 +4081,7 @@
               <w:jc w:val="both"/>
             </w:pPr>
             <w:r>
-              <w:t>Uncheck</w:t>
+              <w:t>Lấy từ VNeID</w:t>
             </w:r>
           </w:p>
         </w:tc>
@@ -3188,13 +4093,10 @@
           <w:p>
             <w:pPr>
               <w:spacing w:before="60" w:after="60" w:line="240" w:lineRule="auto"/>
-            </w:pPr>
-            <w:r>
-              <w:t>Control UI: Checkbox.</w:t>
-            </w:r>
-            <w:r>
-              <w:br/>
-              <w:t>- Chọn nhu cầu sử dụng nhóm chức năng đăng ký BPBĐ.</w:t>
+              <w:jc w:val="both"/>
+            </w:pPr>
+            <w:r>
+              <w:t>Control UI: Hộp chọn.</w:t>
             </w:r>
           </w:p>
         </w:tc>
@@ -3211,7 +4113,7 @@
               <w:jc w:val="both"/>
             </w:pPr>
             <w:r>
-              <w:t>Tài khoản tra cứu</w:t>
+              <w:t>Số điện thoại</w:t>
             </w:r>
           </w:p>
         </w:tc>
@@ -3226,7 +4128,7 @@
               <w:jc w:val="both"/>
             </w:pPr>
             <w:r>
-              <w:t>Boolean</w:t>
+              <w:t>String(20)</w:t>
             </w:r>
           </w:p>
         </w:tc>
@@ -3256,7 +4158,7 @@
               <w:jc w:val="both"/>
             </w:pPr>
             <w:r>
-              <w:t>Uncheck</w:t>
+              <w:t>Lấy từ VNeID nếu có</w:t>
             </w:r>
           </w:p>
         </w:tc>
@@ -3268,13 +4170,10 @@
           <w:p>
             <w:pPr>
               <w:spacing w:before="60" w:after="60" w:line="240" w:lineRule="auto"/>
-            </w:pPr>
-            <w:r>
-              <w:t>Control UI: Checkbox.</w:t>
-            </w:r>
-            <w:r>
-              <w:br/>
-              <w:t>- Chọn nhu cầu sử dụng nhóm chức năng tra cứu/cấp mã số sử dụng CSDL.</w:t>
+              <w:jc w:val="both"/>
+            </w:pPr>
+            <w:r>
+              <w:t>Cho phép bổ sung/cập nhật.</w:t>
             </w:r>
           </w:p>
         </w:tc>
@@ -3291,7 +4190,7 @@
               <w:jc w:val="both"/>
             </w:pPr>
             <w:r>
-              <w:t>Thiết lập đăng nhập bằng Email/Mật khẩu</w:t>
+              <w:t>Phân loại khách hàng</w:t>
             </w:r>
           </w:p>
         </w:tc>
@@ -3306,7 +4205,7 @@
               <w:jc w:val="both"/>
             </w:pPr>
             <w:r>
-              <w:t>Boolean</w:t>
+              <w:t>Enum(String(50))</w:t>
             </w:r>
           </w:p>
         </w:tc>
@@ -3321,7 +4220,7 @@
               <w:jc w:val="both"/>
             </w:pPr>
             <w:r>
-              <w:t>Không</w:t>
+              <w:t>Có</w:t>
             </w:r>
           </w:p>
         </w:tc>
@@ -3336,7 +4235,7 @@
               <w:jc w:val="both"/>
             </w:pPr>
             <w:r>
-              <w:t>Uncheck</w:t>
+              <w:t>Theo Quốc tịch</w:t>
             </w:r>
           </w:p>
         </w:tc>
@@ -3348,13 +4247,10 @@
           <w:p>
             <w:pPr>
               <w:spacing w:before="60" w:after="60" w:line="240" w:lineRule="auto"/>
-            </w:pPr>
-            <w:r>
-              <w:t>Control UI: Checkbox.</w:t>
-            </w:r>
-            <w:r>
-              <w:br/>
-              <w:t>- Nếu tích chọn: hiển thị các trường nhập Email và Mật khẩu trên form.</w:t>
+              <w:jc w:val="both"/>
+            </w:pPr>
+            <w:r>
+              <w:t>Tự động gợi ý: Trong nước (nếu Quốc tịch Việt Nam) hoặc Nước ngoài.</w:t>
             </w:r>
           </w:p>
         </w:tc>
@@ -3371,10 +4267,7 @@
               <w:jc w:val="both"/>
             </w:pPr>
             <w:r>
-              <w:rPr>
-                <w:bCs/>
-              </w:rPr>
-              <w:t>II. Thông tin Cá nhân</w:t>
+              <w:t>Tỉnh/Thành phố</w:t>
             </w:r>
           </w:p>
         </w:tc>
@@ -3388,6 +4281,9 @@
               <w:spacing w:before="60" w:after="60" w:line="240" w:lineRule="auto"/>
               <w:jc w:val="both"/>
             </w:pPr>
+            <w:r>
+              <w:t>Enum(String(100))</w:t>
+            </w:r>
           </w:p>
         </w:tc>
         <w:tc>
@@ -3400,6 +4296,9 @@
               <w:spacing w:before="60" w:after="60" w:line="240" w:lineRule="auto"/>
               <w:jc w:val="both"/>
             </w:pPr>
+            <w:r>
+              <w:t>Có</w:t>
+            </w:r>
           </w:p>
         </w:tc>
         <w:tc>
@@ -3412,6 +4311,9 @@
               <w:spacing w:before="60" w:after="60" w:line="240" w:lineRule="auto"/>
               <w:jc w:val="both"/>
             </w:pPr>
+            <w:r>
+              <w:t>Lấy từ VNeID nếu có</w:t>
+            </w:r>
           </w:p>
         </w:tc>
         <w:tc>
@@ -3425,7 +4327,7 @@
               <w:jc w:val="both"/>
             </w:pPr>
             <w:r>
-              <w:t>Chỉ hiển thị khi loại chủ thể là Cá nhân.</w:t>
+              <w:t>Tham chiếu Danh mục Tỉnh/Thành phố [DM_13].</w:t>
             </w:r>
           </w:p>
         </w:tc>
@@ -3442,7 +4344,7 @@
               <w:jc w:val="both"/>
             </w:pPr>
             <w:r>
-              <w:t>Loại tài khoản</w:t>
+              <w:t>Phường/Xã</w:t>
             </w:r>
           </w:p>
         </w:tc>
@@ -3457,7 +4359,7 @@
               <w:jc w:val="both"/>
             </w:pPr>
             <w:r>
-              <w:t>Enum(String(50))</w:t>
+              <w:t>Enum(String(100))</w:t>
             </w:r>
           </w:p>
         </w:tc>
@@ -3487,7 +4389,7 @@
               <w:jc w:val="both"/>
             </w:pPr>
             <w:r>
-              <w:t>Cá nhân</w:t>
+              <w:t>Lấy từ VNeID nếu có</w:t>
             </w:r>
           </w:p>
         </w:tc>
@@ -3502,7 +4404,7 @@
               <w:jc w:val="both"/>
             </w:pPr>
             <w:r>
-              <w:t>Chỉ đọc.</w:t>
+              <w:t>Tham chiếu Danh mục Xã/Phường/Thị trấn [DM_15].</w:t>
             </w:r>
           </w:p>
         </w:tc>
@@ -3519,7 +4421,7 @@
               <w:jc w:val="both"/>
             </w:pPr>
             <w:r>
-              <w:t>Email (Tên đăng nhập)</w:t>
+              <w:t>Địa chỉ chi tiết</w:t>
             </w:r>
           </w:p>
         </w:tc>
@@ -3534,7 +4436,7 @@
               <w:jc w:val="both"/>
             </w:pPr>
             <w:r>
-              <w:t>String(255)</w:t>
+              <w:t>Text(1000)</w:t>
             </w:r>
           </w:p>
         </w:tc>
@@ -3549,7 +4451,7 @@
               <w:jc w:val="both"/>
             </w:pPr>
             <w:r>
-              <w:t>Có điều kiện</w:t>
+              <w:t>Có</w:t>
             </w:r>
           </w:p>
         </w:tc>
@@ -3564,7 +4466,7 @@
               <w:jc w:val="both"/>
             </w:pPr>
             <w:r>
-              <w:t>Theo Email VNeID nếu có</w:t>
+              <w:t>Lấy từ VNeID nếu có</w:t>
             </w:r>
           </w:p>
         </w:tc>
@@ -3579,7 +4481,7 @@
               <w:jc w:val="both"/>
             </w:pPr>
             <w:r>
-              <w:t>Chỉ hiển thị và bắt buộc khi chọn “Thiết lập đăng nhập bằng Email/Mật khẩu”. Áp dụng [BR-VAL-002] và [BR-VAL-009].</w:t>
+              <w:t>Nhập số nhà, tên đường/thôn xóm. Áp dụng [BR-VAL-001].</w:t>
             </w:r>
           </w:p>
         </w:tc>
@@ -3596,7 +4498,7 @@
               <w:jc w:val="both"/>
             </w:pPr>
             <w:r>
-              <w:t>Mật khẩu đăng nhập</w:t>
+              <w:t>Trung tâm Đăng ký mặc định</w:t>
             </w:r>
           </w:p>
         </w:tc>
@@ -3611,7 +4513,7 @@
               <w:jc w:val="both"/>
             </w:pPr>
             <w:r>
-              <w:t>Password</w:t>
+              <w:t>Enum(String(100))</w:t>
             </w:r>
           </w:p>
         </w:tc>
@@ -3626,7 +4528,7 @@
               <w:jc w:val="both"/>
             </w:pPr>
             <w:r>
-              <w:t>Có điều kiện</w:t>
+              <w:t>Có</w:t>
             </w:r>
           </w:p>
         </w:tc>
@@ -3641,7 +4543,7 @@
               <w:jc w:val="both"/>
             </w:pPr>
             <w:r>
-              <w:t>Trống</w:t>
+              <w:t>Theo cấu hình</w:t>
             </w:r>
           </w:p>
         </w:tc>
@@ -3656,7 +4558,7 @@
               <w:jc w:val="both"/>
             </w:pPr>
             <w:r>
-              <w:t>Chỉ hiển thị và bắt buộc khi chọn “Thiết lập đăng nhập bằng Email/Mật khẩu”. Áp dụng [BR-VAL-006].</w:t>
+              <w:t>Tham chiếu Danh mục Trung tâm giao dịch bảo đảm [DM_08].</w:t>
             </w:r>
           </w:p>
         </w:tc>
@@ -3673,7 +4575,7 @@
               <w:jc w:val="both"/>
             </w:pPr>
             <w:r>
-              <w:t>Nhập lại mật khẩu</w:t>
+              <w:t>Cây phân quyền</w:t>
             </w:r>
           </w:p>
         </w:tc>
@@ -3688,7 +4590,7 @@
               <w:jc w:val="both"/>
             </w:pPr>
             <w:r>
-              <w:t>Password</w:t>
+              <w:t>Tree/Checkbox</w:t>
             </w:r>
           </w:p>
         </w:tc>
@@ -3703,7 +4605,7 @@
               <w:jc w:val="both"/>
             </w:pPr>
             <w:r>
-              <w:t>Có điều kiện</w:t>
+              <w:t>Có</w:t>
             </w:r>
           </w:p>
         </w:tc>
@@ -3718,7 +4620,7 @@
               <w:jc w:val="both"/>
             </w:pPr>
             <w:r>
-              <w:t>Trống</w:t>
+              <w:t>Theo nhu cầu sử dụng</w:t>
             </w:r>
           </w:p>
         </w:tc>
@@ -3733,7 +4635,7 @@
               <w:jc w:val="both"/>
             </w:pPr>
             <w:r>
-              <w:t>Chỉ hiển thị và bắt buộc khi chọn “Thiết lập đăng nhập bằng Email/Mật khẩu”.</w:t>
+              <w:t>Danh sách quyền tương ứng nhóm chức năng đã chọn.</w:t>
             </w:r>
           </w:p>
         </w:tc>
@@ -3750,7 +4652,10 @@
               <w:jc w:val="both"/>
             </w:pPr>
             <w:r>
-              <w:t>Loại giấy tờ</w:t>
+              <w:rPr>
+                <w:bCs/>
+              </w:rPr>
+              <w:t>III. Thông tin Tổ chức</w:t>
             </w:r>
           </w:p>
         </w:tc>
@@ -3764,9 +4669,6 @@
               <w:spacing w:before="60" w:after="60" w:line="240" w:lineRule="auto"/>
               <w:jc w:val="both"/>
             </w:pPr>
-            <w:r>
-              <w:t>Enum(String(50))</w:t>
-            </w:r>
           </w:p>
         </w:tc>
         <w:tc>
@@ -3779,9 +4681,6 @@
               <w:spacing w:before="60" w:after="60" w:line="240" w:lineRule="auto"/>
               <w:jc w:val="both"/>
             </w:pPr>
-            <w:r>
-              <w:t>Có</w:t>
-            </w:r>
           </w:p>
         </w:tc>
         <w:tc>
@@ -3794,9 +4693,6 @@
               <w:spacing w:before="60" w:after="60" w:line="240" w:lineRule="auto"/>
               <w:jc w:val="both"/>
             </w:pPr>
-            <w:r>
-              <w:t>Lấy từ VNeID</w:t>
-            </w:r>
           </w:p>
         </w:tc>
         <w:tc>
@@ -3810,7 +4706,7 @@
               <w:jc w:val="both"/>
             </w:pPr>
             <w:r>
-              <w:t>Chỉ đọc.</w:t>
+              <w:t>Chỉ hiển thị khi chủ thể là Tổ chức hoặc Đại diện tổ chức.</w:t>
             </w:r>
           </w:p>
         </w:tc>
@@ -3827,7 +4723,7 @@
               <w:jc w:val="both"/>
             </w:pPr>
             <w:r>
-              <w:t>Số giấy tờ</w:t>
+              <w:t>Loại tài khoản</w:t>
             </w:r>
           </w:p>
         </w:tc>
@@ -3842,7 +4738,11 @@
               <w:jc w:val="both"/>
             </w:pPr>
             <w:r>
-              <w:t>String(255)</w:t>
+              <w:t>Enum(String</w:t>
+            </w:r>
+            <w:r>
+              <w:lastRenderedPageBreak/>
+              <w:t>(50))</w:t>
             </w:r>
           </w:p>
         </w:tc>
@@ -3857,6 +4757,7 @@
               <w:jc w:val="both"/>
             </w:pPr>
             <w:r>
+              <w:lastRenderedPageBreak/>
               <w:t>Có</w:t>
             </w:r>
           </w:p>
@@ -3872,11 +4773,11 @@
               <w:jc w:val="both"/>
             </w:pPr>
             <w:r>
-              <w:t>Lấy từ VNeI</w:t>
+              <w:t xml:space="preserve">Tổ </w:t>
             </w:r>
             <w:r>
               <w:lastRenderedPageBreak/>
-              <w:t>D</w:t>
+              <w:t>chức</w:t>
             </w:r>
           </w:p>
         </w:tc>
@@ -3909,7 +4810,7 @@
               <w:jc w:val="both"/>
             </w:pPr>
             <w:r>
-              <w:t>Họ và tên</w:t>
+              <w:t>Loại tổ chức</w:t>
             </w:r>
           </w:p>
         </w:tc>
@@ -3924,7 +4825,7 @@
               <w:jc w:val="both"/>
             </w:pPr>
             <w:r>
-              <w:t>String(255)</w:t>
+              <w:t>Enum(String(100))</w:t>
             </w:r>
           </w:p>
         </w:tc>
@@ -3954,7 +4855,7 @@
               <w:jc w:val="both"/>
             </w:pPr>
             <w:r>
-              <w:t>Lấy từ VNeID</w:t>
+              <w:t>Theo VNeID/cấu hình</w:t>
             </w:r>
           </w:p>
         </w:tc>
@@ -3969,7 +4870,7 @@
               <w:jc w:val="both"/>
             </w:pPr>
             <w:r>
-              <w:t>Chỉ đọc.</w:t>
+              <w:t>Control UI: Hộp chọn.</w:t>
             </w:r>
           </w:p>
         </w:tc>
@@ -3986,7 +4887,7 @@
               <w:jc w:val="both"/>
             </w:pPr>
             <w:r>
-              <w:t>Ngày sinh</w:t>
+              <w:t>Mã định danh tổ chức</w:t>
             </w:r>
           </w:p>
         </w:tc>
@@ -4001,7 +4902,7 @@
               <w:jc w:val="both"/>
             </w:pPr>
             <w:r>
-              <w:t>Date</w:t>
+              <w:t>String(100)</w:t>
             </w:r>
           </w:p>
         </w:tc>
@@ -4016,7 +4917,7 @@
               <w:jc w:val="both"/>
             </w:pPr>
             <w:r>
-              <w:t>Không</w:t>
+              <w:t>Có</w:t>
             </w:r>
           </w:p>
         </w:tc>
@@ -4046,7 +4947,7 @@
               <w:jc w:val="both"/>
             </w:pPr>
             <w:r>
-              <w:t>Lấy từ VNeID nếu có, cho phép nhập nếu trống.</w:t>
+              <w:t>Chỉ đọc.</w:t>
             </w:r>
           </w:p>
         </w:tc>
@@ -4063,7 +4964,7 @@
               <w:jc w:val="both"/>
             </w:pPr>
             <w:r>
-              <w:t>Giới tính</w:t>
+              <w:t>Mã số thuế/Số giấy phép</w:t>
             </w:r>
           </w:p>
         </w:tc>
@@ -4078,7 +4979,7 @@
               <w:jc w:val="both"/>
             </w:pPr>
             <w:r>
-              <w:t>Enum(String(50))</w:t>
+              <w:t>String(100)</w:t>
             </w:r>
           </w:p>
         </w:tc>
@@ -4093,7 +4994,7 @@
               <w:jc w:val="both"/>
             </w:pPr>
             <w:r>
-              <w:t>Không</w:t>
+              <w:t>Có</w:t>
             </w:r>
           </w:p>
         </w:tc>
@@ -4108,7 +5009,7 @@
               <w:jc w:val="both"/>
             </w:pPr>
             <w:r>
-              <w:t>Lấy từ VNeID</w:t>
+              <w:t>Lấy từ VNeID nếu có</w:t>
             </w:r>
           </w:p>
         </w:tc>
@@ -4123,7 +5024,7 @@
               <w:jc w:val="both"/>
             </w:pPr>
             <w:r>
-              <w:t>Lấy từ VNeID nếu có, cho phép chọn nếu trống.</w:t>
+              <w:t>Cho phép nhập nếu VNeID không trả về.</w:t>
             </w:r>
           </w:p>
         </w:tc>
@@ -4140,7 +5041,7 @@
               <w:jc w:val="both"/>
             </w:pPr>
             <w:r>
-              <w:t>Quốc tịch</w:t>
+              <w:t>Tên tổ chức</w:t>
             </w:r>
           </w:p>
         </w:tc>
@@ -4155,7 +5056,7 @@
               <w:jc w:val="both"/>
             </w:pPr>
             <w:r>
-              <w:t>Enum(String(100))</w:t>
+              <w:t>String(255)</w:t>
             </w:r>
           </w:p>
         </w:tc>
@@ -4200,7 +5101,7 @@
               <w:jc w:val="both"/>
             </w:pPr>
             <w:r>
-              <w:t>Control UI: Hộp chọn.</w:t>
+              <w:t>Chỉ đọc.</w:t>
             </w:r>
           </w:p>
         </w:tc>
@@ -4217,7 +5118,7 @@
               <w:jc w:val="both"/>
             </w:pPr>
             <w:r>
-              <w:t>Số điện thoại</w:t>
+              <w:t>Email tổ chức (Tên đăng nhập)</w:t>
             </w:r>
           </w:p>
         </w:tc>
@@ -4232,7 +5133,7 @@
               <w:jc w:val="both"/>
             </w:pPr>
             <w:r>
-              <w:t>String(20)</w:t>
+              <w:t>String(255)</w:t>
             </w:r>
           </w:p>
         </w:tc>
@@ -4247,7 +5148,7 @@
               <w:jc w:val="both"/>
             </w:pPr>
             <w:r>
-              <w:t>Không</w:t>
+              <w:t>Có điều kiện</w:t>
             </w:r>
           </w:p>
         </w:tc>
@@ -4262,7 +5163,7 @@
               <w:jc w:val="both"/>
             </w:pPr>
             <w:r>
-              <w:t>Lấy từ VNeID nếu có</w:t>
+              <w:t>Theo Email VNeID nếu có</w:t>
             </w:r>
           </w:p>
         </w:tc>
@@ -4277,7 +5178,7 @@
               <w:jc w:val="both"/>
             </w:pPr>
             <w:r>
-              <w:t>Cho phép bổ sung/cập nhật.</w:t>
+              <w:t>Áp dụng [BR-VAL-002] và [BR-VAL-009].</w:t>
             </w:r>
           </w:p>
         </w:tc>
@@ -4294,7 +5195,7 @@
               <w:jc w:val="both"/>
             </w:pPr>
             <w:r>
-              <w:t>Phân loại khách hàng</w:t>
+              <w:t>Mật khẩu đăng nhập</w:t>
             </w:r>
           </w:p>
         </w:tc>
@@ -4309,7 +5210,7 @@
               <w:jc w:val="both"/>
             </w:pPr>
             <w:r>
-              <w:t>Enum(String(50))</w:t>
+              <w:t>Password</w:t>
             </w:r>
           </w:p>
         </w:tc>
@@ -4324,7 +5225,7 @@
               <w:jc w:val="both"/>
             </w:pPr>
             <w:r>
-              <w:t>Có</w:t>
+              <w:t>Có điều kiện</w:t>
             </w:r>
           </w:p>
         </w:tc>
@@ -4339,7 +5240,7 @@
               <w:jc w:val="both"/>
             </w:pPr>
             <w:r>
-              <w:t>Theo Quốc tịch</w:t>
+              <w:t>Trống</w:t>
             </w:r>
           </w:p>
         </w:tc>
@@ -4354,7 +5255,7 @@
               <w:jc w:val="both"/>
             </w:pPr>
             <w:r>
-              <w:t>Tự động gợi ý: Trong nước (nếu Quốc tịch Việt Nam) hoặc Nước ngoài.</w:t>
+              <w:t>Áp dụng [BR-VAL-006].</w:t>
             </w:r>
           </w:p>
         </w:tc>
@@ -4371,7 +5272,7 @@
               <w:jc w:val="both"/>
             </w:pPr>
             <w:r>
-              <w:t>Tỉnh/Thành phố</w:t>
+              <w:t>Nhập lại mật khẩu</w:t>
             </w:r>
           </w:p>
         </w:tc>
@@ -4386,7 +5287,7 @@
               <w:jc w:val="both"/>
             </w:pPr>
             <w:r>
-              <w:t>Enum(String(100))</w:t>
+              <w:t>Password</w:t>
             </w:r>
           </w:p>
         </w:tc>
@@ -4401,7 +5302,7 @@
               <w:jc w:val="both"/>
             </w:pPr>
             <w:r>
-              <w:t>Có</w:t>
+              <w:t>Có điều kiện</w:t>
             </w:r>
           </w:p>
         </w:tc>
@@ -4416,7 +5317,7 @@
               <w:jc w:val="both"/>
             </w:pPr>
             <w:r>
-              <w:t>Lấy từ VNeID nếu có</w:t>
+              <w:t>Trống</w:t>
             </w:r>
           </w:p>
         </w:tc>
@@ -4431,7 +5332,7 @@
               <w:jc w:val="both"/>
             </w:pPr>
             <w:r>
-              <w:t>Tham chiếu Danh mục Tỉnh/Thành phố [DM_13].</w:t>
+              <w:t>Phải trùng khớp với Mật khẩu đăng nhập.</w:t>
             </w:r>
           </w:p>
         </w:tc>
@@ -4448,7 +5349,7 @@
               <w:jc w:val="both"/>
             </w:pPr>
             <w:r>
-              <w:t>Phường/Xã</w:t>
+              <w:t>Quốc gia đăng ký</w:t>
             </w:r>
           </w:p>
         </w:tc>
@@ -4493,7 +5394,7 @@
               <w:jc w:val="both"/>
             </w:pPr>
             <w:r>
-              <w:t>Lấy từ VNeID nếu có</w:t>
+              <w:t>Lấy từ VNeID</w:t>
             </w:r>
           </w:p>
         </w:tc>
@@ -4508,7 +5409,7 @@
               <w:jc w:val="both"/>
             </w:pPr>
             <w:r>
-              <w:t>Tham chiếu Danh mục Xã/Phường/Thị trấn [DM_15].</w:t>
+              <w:t>Control UI: Hộp chọn.</w:t>
             </w:r>
           </w:p>
         </w:tc>
@@ -4525,7 +5426,7 @@
               <w:jc w:val="both"/>
             </w:pPr>
             <w:r>
-              <w:t>Địa chỉ chi tiết</w:t>
+              <w:t>Phân loại khách hàng</w:t>
             </w:r>
           </w:p>
         </w:tc>
@@ -4540,7 +5441,7 @@
               <w:jc w:val="both"/>
             </w:pPr>
             <w:r>
-              <w:t>Text(1000)</w:t>
+              <w:t>Enum(String(50))</w:t>
             </w:r>
           </w:p>
         </w:tc>
@@ -4570,7 +5471,7 @@
               <w:jc w:val="both"/>
             </w:pPr>
             <w:r>
-              <w:t>Lấy từ VNeID nếu có</w:t>
+              <w:t>Theo Quốc gia đăng ký</w:t>
             </w:r>
           </w:p>
         </w:tc>
@@ -4585,7 +5486,7 @@
               <w:jc w:val="both"/>
             </w:pPr>
             <w:r>
-              <w:t>Nhập số nhà, tên đường/thôn xóm. Áp dụng [BR-VAL-001].</w:t>
+              <w:t>Gồm Trong nước hoặc Nước ngoài.</w:t>
             </w:r>
           </w:p>
         </w:tc>
@@ -4602,1007 +5503,7 @@
               <w:jc w:val="both"/>
             </w:pPr>
             <w:r>
-              <w:t>Trung tâm Đăng ký mặc định</w:t>
-            </w:r>
-          </w:p>
-        </w:tc>
-        <w:tc>
-          <w:tcPr>
-            <w:tcW w:w="1584" w:type="dxa"/>
-            <w:shd w:val="clear" w:color="auto" w:fill="auto"/>
-          </w:tcPr>
-          <w:p>
-            <w:pPr>
-              <w:spacing w:before="60" w:after="60" w:line="240" w:lineRule="auto"/>
-              <w:jc w:val="both"/>
-            </w:pPr>
-            <w:r>
-              <w:t>Enum(String(100))</w:t>
-            </w:r>
-          </w:p>
-        </w:tc>
-        <w:tc>
-          <w:tcPr>
-            <w:tcW w:w="979" w:type="dxa"/>
-            <w:shd w:val="clear" w:color="auto" w:fill="auto"/>
-          </w:tcPr>
-          <w:p>
-            <w:pPr>
-              <w:spacing w:before="60" w:after="60" w:line="240" w:lineRule="auto"/>
-              <w:jc w:val="both"/>
-            </w:pPr>
-            <w:r>
-              <w:t>Có</w:t>
-            </w:r>
-          </w:p>
-        </w:tc>
-        <w:tc>
-          <w:tcPr>
-            <w:tcW w:w="979" w:type="dxa"/>
-            <w:shd w:val="clear" w:color="auto" w:fill="auto"/>
-          </w:tcPr>
-          <w:p>
-            <w:pPr>
-              <w:spacing w:before="60" w:after="60" w:line="240" w:lineRule="auto"/>
-              <w:jc w:val="both"/>
-            </w:pPr>
-            <w:r>
-              <w:t xml:space="preserve">Theo cấu </w:t>
-            </w:r>
-            <w:r>
               <w:lastRenderedPageBreak/>
-              <w:t>hình</w:t>
-            </w:r>
-          </w:p>
-        </w:tc>
-        <w:tc>
-          <w:tcPr>
-            <w:tcW w:w="3773" w:type="dxa"/>
-            <w:shd w:val="clear" w:color="auto" w:fill="auto"/>
-          </w:tcPr>
-          <w:p>
-            <w:pPr>
-              <w:spacing w:before="60" w:after="60" w:line="240" w:lineRule="auto"/>
-              <w:jc w:val="both"/>
-            </w:pPr>
-            <w:r>
-              <w:lastRenderedPageBreak/>
-              <w:t>Tham chiếu Danh mục Trung tâm giao dịch bảo đảm [DM_08].</w:t>
-            </w:r>
-          </w:p>
-        </w:tc>
-      </w:tr>
-      <w:tr>
-        <w:tc>
-          <w:tcPr>
-            <w:tcW w:w="2362" w:type="dxa"/>
-            <w:shd w:val="clear" w:color="auto" w:fill="auto"/>
-          </w:tcPr>
-          <w:p>
-            <w:pPr>
-              <w:spacing w:before="60" w:after="60" w:line="240" w:lineRule="auto"/>
-              <w:jc w:val="both"/>
-            </w:pPr>
-            <w:r>
-              <w:t>Cây phân quyền</w:t>
-            </w:r>
-          </w:p>
-        </w:tc>
-        <w:tc>
-          <w:tcPr>
-            <w:tcW w:w="1584" w:type="dxa"/>
-            <w:shd w:val="clear" w:color="auto" w:fill="auto"/>
-          </w:tcPr>
-          <w:p>
-            <w:pPr>
-              <w:spacing w:before="60" w:after="60" w:line="240" w:lineRule="auto"/>
-              <w:jc w:val="both"/>
-            </w:pPr>
-            <w:r>
-              <w:t>Tree/Checkbox</w:t>
-            </w:r>
-          </w:p>
-        </w:tc>
-        <w:tc>
-          <w:tcPr>
-            <w:tcW w:w="979" w:type="dxa"/>
-            <w:shd w:val="clear" w:color="auto" w:fill="auto"/>
-          </w:tcPr>
-          <w:p>
-            <w:pPr>
-              <w:spacing w:before="60" w:after="60" w:line="240" w:lineRule="auto"/>
-              <w:jc w:val="both"/>
-            </w:pPr>
-            <w:r>
-              <w:t>Có</w:t>
-            </w:r>
-          </w:p>
-        </w:tc>
-        <w:tc>
-          <w:tcPr>
-            <w:tcW w:w="979" w:type="dxa"/>
-            <w:shd w:val="clear" w:color="auto" w:fill="auto"/>
-          </w:tcPr>
-          <w:p>
-            <w:pPr>
-              <w:spacing w:before="60" w:after="60" w:line="240" w:lineRule="auto"/>
-              <w:jc w:val="both"/>
-            </w:pPr>
-            <w:r>
-              <w:t>Theo nhu cầu sử dụng</w:t>
-            </w:r>
-          </w:p>
-        </w:tc>
-        <w:tc>
-          <w:tcPr>
-            <w:tcW w:w="3773" w:type="dxa"/>
-            <w:shd w:val="clear" w:color="auto" w:fill="auto"/>
-          </w:tcPr>
-          <w:p>
-            <w:pPr>
-              <w:spacing w:before="60" w:after="60" w:line="240" w:lineRule="auto"/>
-              <w:jc w:val="both"/>
-            </w:pPr>
-            <w:r>
-              <w:t>Danh sách quyền tương ứng nhóm chức năng đã chọn.</w:t>
-            </w:r>
-          </w:p>
-        </w:tc>
-      </w:tr>
-      <w:tr>
-        <w:tc>
-          <w:tcPr>
-            <w:tcW w:w="2362" w:type="dxa"/>
-            <w:shd w:val="clear" w:color="auto" w:fill="auto"/>
-          </w:tcPr>
-          <w:p>
-            <w:pPr>
-              <w:spacing w:before="60" w:after="60" w:line="240" w:lineRule="auto"/>
-              <w:jc w:val="both"/>
-            </w:pPr>
-            <w:r>
-              <w:rPr>
-                <w:bCs/>
-              </w:rPr>
-              <w:t>III. Thông tin Tổ chức</w:t>
-            </w:r>
-          </w:p>
-        </w:tc>
-        <w:tc>
-          <w:tcPr>
-            <w:tcW w:w="1584" w:type="dxa"/>
-            <w:shd w:val="clear" w:color="auto" w:fill="auto"/>
-          </w:tcPr>
-          <w:p>
-            <w:pPr>
-              <w:spacing w:before="60" w:after="60" w:line="240" w:lineRule="auto"/>
-              <w:jc w:val="both"/>
-            </w:pPr>
-          </w:p>
-        </w:tc>
-        <w:tc>
-          <w:tcPr>
-            <w:tcW w:w="979" w:type="dxa"/>
-            <w:shd w:val="clear" w:color="auto" w:fill="auto"/>
-          </w:tcPr>
-          <w:p>
-            <w:pPr>
-              <w:spacing w:before="60" w:after="60" w:line="240" w:lineRule="auto"/>
-              <w:jc w:val="both"/>
-            </w:pPr>
-          </w:p>
-        </w:tc>
-        <w:tc>
-          <w:tcPr>
-            <w:tcW w:w="979" w:type="dxa"/>
-            <w:shd w:val="clear" w:color="auto" w:fill="auto"/>
-          </w:tcPr>
-          <w:p>
-            <w:pPr>
-              <w:spacing w:before="60" w:after="60" w:line="240" w:lineRule="auto"/>
-              <w:jc w:val="both"/>
-            </w:pPr>
-          </w:p>
-        </w:tc>
-        <w:tc>
-          <w:tcPr>
-            <w:tcW w:w="3773" w:type="dxa"/>
-            <w:shd w:val="clear" w:color="auto" w:fill="auto"/>
-          </w:tcPr>
-          <w:p>
-            <w:pPr>
-              <w:spacing w:before="60" w:after="60" w:line="240" w:lineRule="auto"/>
-              <w:jc w:val="both"/>
-            </w:pPr>
-            <w:r>
-              <w:t>Chỉ hiển thị khi chủ thể là Tổ chức hoặc Đại diện tổ chức.</w:t>
-            </w:r>
-          </w:p>
-        </w:tc>
-      </w:tr>
-      <w:tr>
-        <w:tc>
-          <w:tcPr>
-            <w:tcW w:w="2362" w:type="dxa"/>
-            <w:shd w:val="clear" w:color="auto" w:fill="auto"/>
-          </w:tcPr>
-          <w:p>
-            <w:pPr>
-              <w:spacing w:before="60" w:after="60" w:line="240" w:lineRule="auto"/>
-              <w:jc w:val="both"/>
-            </w:pPr>
-            <w:r>
-              <w:t>Loại tài khoản</w:t>
-            </w:r>
-          </w:p>
-        </w:tc>
-        <w:tc>
-          <w:tcPr>
-            <w:tcW w:w="1584" w:type="dxa"/>
-            <w:shd w:val="clear" w:color="auto" w:fill="auto"/>
-          </w:tcPr>
-          <w:p>
-            <w:pPr>
-              <w:spacing w:before="60" w:after="60" w:line="240" w:lineRule="auto"/>
-              <w:jc w:val="both"/>
-            </w:pPr>
-            <w:r>
-              <w:t>Enum(String(50))</w:t>
-            </w:r>
-          </w:p>
-        </w:tc>
-        <w:tc>
-          <w:tcPr>
-            <w:tcW w:w="979" w:type="dxa"/>
-            <w:shd w:val="clear" w:color="auto" w:fill="auto"/>
-          </w:tcPr>
-          <w:p>
-            <w:pPr>
-              <w:spacing w:before="60" w:after="60" w:line="240" w:lineRule="auto"/>
-              <w:jc w:val="both"/>
-            </w:pPr>
-            <w:r>
-              <w:t>Có</w:t>
-            </w:r>
-          </w:p>
-        </w:tc>
-        <w:tc>
-          <w:tcPr>
-            <w:tcW w:w="979" w:type="dxa"/>
-            <w:shd w:val="clear" w:color="auto" w:fill="auto"/>
-          </w:tcPr>
-          <w:p>
-            <w:pPr>
-              <w:spacing w:before="60" w:after="60" w:line="240" w:lineRule="auto"/>
-              <w:jc w:val="both"/>
-            </w:pPr>
-            <w:r>
-              <w:t>Tổ chức</w:t>
-            </w:r>
-          </w:p>
-        </w:tc>
-        <w:tc>
-          <w:tcPr>
-            <w:tcW w:w="3773" w:type="dxa"/>
-            <w:shd w:val="clear" w:color="auto" w:fill="auto"/>
-          </w:tcPr>
-          <w:p>
-            <w:pPr>
-              <w:spacing w:before="60" w:after="60" w:line="240" w:lineRule="auto"/>
-              <w:jc w:val="both"/>
-            </w:pPr>
-            <w:r>
-              <w:t>Chỉ đọc.</w:t>
-            </w:r>
-          </w:p>
-        </w:tc>
-      </w:tr>
-      <w:tr>
-        <w:tc>
-          <w:tcPr>
-            <w:tcW w:w="2362" w:type="dxa"/>
-            <w:shd w:val="clear" w:color="auto" w:fill="auto"/>
-          </w:tcPr>
-          <w:p>
-            <w:pPr>
-              <w:spacing w:before="60" w:after="60" w:line="240" w:lineRule="auto"/>
-              <w:jc w:val="both"/>
-            </w:pPr>
-            <w:r>
-              <w:t>Loại tổ chức</w:t>
-            </w:r>
-          </w:p>
-        </w:tc>
-        <w:tc>
-          <w:tcPr>
-            <w:tcW w:w="1584" w:type="dxa"/>
-            <w:shd w:val="clear" w:color="auto" w:fill="auto"/>
-          </w:tcPr>
-          <w:p>
-            <w:pPr>
-              <w:spacing w:before="60" w:after="60" w:line="240" w:lineRule="auto"/>
-              <w:jc w:val="both"/>
-            </w:pPr>
-            <w:r>
-              <w:t>Enum(String(100))</w:t>
-            </w:r>
-          </w:p>
-        </w:tc>
-        <w:tc>
-          <w:tcPr>
-            <w:tcW w:w="979" w:type="dxa"/>
-            <w:shd w:val="clear" w:color="auto" w:fill="auto"/>
-          </w:tcPr>
-          <w:p>
-            <w:pPr>
-              <w:spacing w:before="60" w:after="60" w:line="240" w:lineRule="auto"/>
-              <w:jc w:val="both"/>
-            </w:pPr>
-            <w:r>
-              <w:t>Có</w:t>
-            </w:r>
-          </w:p>
-        </w:tc>
-        <w:tc>
-          <w:tcPr>
-            <w:tcW w:w="979" w:type="dxa"/>
-            <w:shd w:val="clear" w:color="auto" w:fill="auto"/>
-          </w:tcPr>
-          <w:p>
-            <w:pPr>
-              <w:spacing w:before="60" w:after="60" w:line="240" w:lineRule="auto"/>
-              <w:jc w:val="both"/>
-            </w:pPr>
-            <w:r>
-              <w:t>Theo VNeID/cấu hình</w:t>
-            </w:r>
-          </w:p>
-        </w:tc>
-        <w:tc>
-          <w:tcPr>
-            <w:tcW w:w="3773" w:type="dxa"/>
-            <w:shd w:val="clear" w:color="auto" w:fill="auto"/>
-          </w:tcPr>
-          <w:p>
-            <w:pPr>
-              <w:spacing w:before="60" w:after="60" w:line="240" w:lineRule="auto"/>
-              <w:jc w:val="both"/>
-            </w:pPr>
-            <w:r>
-              <w:t>Control UI: Hộp chọn.</w:t>
-            </w:r>
-          </w:p>
-        </w:tc>
-      </w:tr>
-      <w:tr>
-        <w:tc>
-          <w:tcPr>
-            <w:tcW w:w="2362" w:type="dxa"/>
-            <w:shd w:val="clear" w:color="auto" w:fill="auto"/>
-          </w:tcPr>
-          <w:p>
-            <w:pPr>
-              <w:spacing w:before="60" w:after="60" w:line="240" w:lineRule="auto"/>
-              <w:jc w:val="both"/>
-            </w:pPr>
-            <w:r>
-              <w:t>Mã định danh tổ chức</w:t>
-            </w:r>
-          </w:p>
-        </w:tc>
-        <w:tc>
-          <w:tcPr>
-            <w:tcW w:w="1584" w:type="dxa"/>
-            <w:shd w:val="clear" w:color="auto" w:fill="auto"/>
-          </w:tcPr>
-          <w:p>
-            <w:pPr>
-              <w:spacing w:before="60" w:after="60" w:line="240" w:lineRule="auto"/>
-              <w:jc w:val="both"/>
-            </w:pPr>
-            <w:r>
-              <w:t>String(100)</w:t>
-            </w:r>
-          </w:p>
-        </w:tc>
-        <w:tc>
-          <w:tcPr>
-            <w:tcW w:w="979" w:type="dxa"/>
-            <w:shd w:val="clear" w:color="auto" w:fill="auto"/>
-          </w:tcPr>
-          <w:p>
-            <w:pPr>
-              <w:spacing w:before="60" w:after="60" w:line="240" w:lineRule="auto"/>
-              <w:jc w:val="both"/>
-            </w:pPr>
-            <w:r>
-              <w:t>Có</w:t>
-            </w:r>
-          </w:p>
-        </w:tc>
-        <w:tc>
-          <w:tcPr>
-            <w:tcW w:w="979" w:type="dxa"/>
-            <w:shd w:val="clear" w:color="auto" w:fill="auto"/>
-          </w:tcPr>
-          <w:p>
-            <w:pPr>
-              <w:spacing w:before="60" w:after="60" w:line="240" w:lineRule="auto"/>
-              <w:jc w:val="both"/>
-            </w:pPr>
-            <w:r>
-              <w:t>Lấy từ VNeID</w:t>
-            </w:r>
-          </w:p>
-        </w:tc>
-        <w:tc>
-          <w:tcPr>
-            <w:tcW w:w="3773" w:type="dxa"/>
-            <w:shd w:val="clear" w:color="auto" w:fill="auto"/>
-          </w:tcPr>
-          <w:p>
-            <w:pPr>
-              <w:spacing w:before="60" w:after="60" w:line="240" w:lineRule="auto"/>
-              <w:jc w:val="both"/>
-            </w:pPr>
-            <w:r>
-              <w:t>Chỉ đọc.</w:t>
-            </w:r>
-          </w:p>
-        </w:tc>
-      </w:tr>
-      <w:tr>
-        <w:tc>
-          <w:tcPr>
-            <w:tcW w:w="2362" w:type="dxa"/>
-            <w:shd w:val="clear" w:color="auto" w:fill="auto"/>
-          </w:tcPr>
-          <w:p>
-            <w:pPr>
-              <w:spacing w:before="60" w:after="60" w:line="240" w:lineRule="auto"/>
-              <w:jc w:val="both"/>
-            </w:pPr>
-            <w:r>
-              <w:t>Mã số thuế/Số giấy phép</w:t>
-            </w:r>
-          </w:p>
-        </w:tc>
-        <w:tc>
-          <w:tcPr>
-            <w:tcW w:w="1584" w:type="dxa"/>
-            <w:shd w:val="clear" w:color="auto" w:fill="auto"/>
-          </w:tcPr>
-          <w:p>
-            <w:pPr>
-              <w:spacing w:before="60" w:after="60" w:line="240" w:lineRule="auto"/>
-              <w:jc w:val="both"/>
-            </w:pPr>
-            <w:r>
-              <w:t>String(100)</w:t>
-            </w:r>
-          </w:p>
-        </w:tc>
-        <w:tc>
-          <w:tcPr>
-            <w:tcW w:w="979" w:type="dxa"/>
-            <w:shd w:val="clear" w:color="auto" w:fill="auto"/>
-          </w:tcPr>
-          <w:p>
-            <w:pPr>
-              <w:spacing w:before="60" w:after="60" w:line="240" w:lineRule="auto"/>
-              <w:jc w:val="both"/>
-            </w:pPr>
-            <w:r>
-              <w:t>Có</w:t>
-            </w:r>
-          </w:p>
-        </w:tc>
-        <w:tc>
-          <w:tcPr>
-            <w:tcW w:w="979" w:type="dxa"/>
-            <w:shd w:val="clear" w:color="auto" w:fill="auto"/>
-          </w:tcPr>
-          <w:p>
-            <w:pPr>
-              <w:spacing w:before="60" w:after="60" w:line="240" w:lineRule="auto"/>
-              <w:jc w:val="both"/>
-            </w:pPr>
-            <w:r>
-              <w:t>Lấy từ VNeID nếu có</w:t>
-            </w:r>
-          </w:p>
-        </w:tc>
-        <w:tc>
-          <w:tcPr>
-            <w:tcW w:w="3773" w:type="dxa"/>
-            <w:shd w:val="clear" w:color="auto" w:fill="auto"/>
-          </w:tcPr>
-          <w:p>
-            <w:pPr>
-              <w:spacing w:before="60" w:after="60" w:line="240" w:lineRule="auto"/>
-              <w:jc w:val="both"/>
-            </w:pPr>
-            <w:r>
-              <w:t>Cho phép nhập nếu VNeID không trả về.</w:t>
-            </w:r>
-          </w:p>
-        </w:tc>
-      </w:tr>
-      <w:tr>
-        <w:tc>
-          <w:tcPr>
-            <w:tcW w:w="2362" w:type="dxa"/>
-            <w:shd w:val="clear" w:color="auto" w:fill="auto"/>
-          </w:tcPr>
-          <w:p>
-            <w:pPr>
-              <w:spacing w:before="60" w:after="60" w:line="240" w:lineRule="auto"/>
-              <w:jc w:val="both"/>
-            </w:pPr>
-            <w:r>
-              <w:t>Tên tổ chức</w:t>
-            </w:r>
-          </w:p>
-        </w:tc>
-        <w:tc>
-          <w:tcPr>
-            <w:tcW w:w="1584" w:type="dxa"/>
-            <w:shd w:val="clear" w:color="auto" w:fill="auto"/>
-          </w:tcPr>
-          <w:p>
-            <w:pPr>
-              <w:spacing w:before="60" w:after="60" w:line="240" w:lineRule="auto"/>
-              <w:jc w:val="both"/>
-            </w:pPr>
-            <w:r>
-              <w:t>String(255)</w:t>
-            </w:r>
-          </w:p>
-        </w:tc>
-        <w:tc>
-          <w:tcPr>
-            <w:tcW w:w="979" w:type="dxa"/>
-            <w:shd w:val="clear" w:color="auto" w:fill="auto"/>
-          </w:tcPr>
-          <w:p>
-            <w:pPr>
-              <w:spacing w:before="60" w:after="60" w:line="240" w:lineRule="auto"/>
-              <w:jc w:val="both"/>
-            </w:pPr>
-            <w:r>
-              <w:t>Có</w:t>
-            </w:r>
-          </w:p>
-        </w:tc>
-        <w:tc>
-          <w:tcPr>
-            <w:tcW w:w="979" w:type="dxa"/>
-            <w:shd w:val="clear" w:color="auto" w:fill="auto"/>
-          </w:tcPr>
-          <w:p>
-            <w:pPr>
-              <w:spacing w:before="60" w:after="60" w:line="240" w:lineRule="auto"/>
-              <w:jc w:val="both"/>
-            </w:pPr>
-            <w:r>
-              <w:t>Lấy từ VNeID</w:t>
-            </w:r>
-          </w:p>
-        </w:tc>
-        <w:tc>
-          <w:tcPr>
-            <w:tcW w:w="3773" w:type="dxa"/>
-            <w:shd w:val="clear" w:color="auto" w:fill="auto"/>
-          </w:tcPr>
-          <w:p>
-            <w:pPr>
-              <w:spacing w:before="60" w:after="60" w:line="240" w:lineRule="auto"/>
-              <w:jc w:val="both"/>
-            </w:pPr>
-            <w:r>
-              <w:t>Chỉ đọc.</w:t>
-            </w:r>
-          </w:p>
-        </w:tc>
-      </w:tr>
-      <w:tr>
-        <w:tc>
-          <w:tcPr>
-            <w:tcW w:w="2362" w:type="dxa"/>
-            <w:shd w:val="clear" w:color="auto" w:fill="auto"/>
-          </w:tcPr>
-          <w:p>
-            <w:pPr>
-              <w:spacing w:before="60" w:after="60" w:line="240" w:lineRule="auto"/>
-              <w:jc w:val="both"/>
-            </w:pPr>
-            <w:r>
-              <w:t>Email tổ chức (Tên đăng nhập)</w:t>
-            </w:r>
-          </w:p>
-        </w:tc>
-        <w:tc>
-          <w:tcPr>
-            <w:tcW w:w="1584" w:type="dxa"/>
-            <w:shd w:val="clear" w:color="auto" w:fill="auto"/>
-          </w:tcPr>
-          <w:p>
-            <w:pPr>
-              <w:spacing w:before="60" w:after="60" w:line="240" w:lineRule="auto"/>
-              <w:jc w:val="both"/>
-            </w:pPr>
-            <w:r>
-              <w:t>String(255)</w:t>
-            </w:r>
-          </w:p>
-        </w:tc>
-        <w:tc>
-          <w:tcPr>
-            <w:tcW w:w="979" w:type="dxa"/>
-            <w:shd w:val="clear" w:color="auto" w:fill="auto"/>
-          </w:tcPr>
-          <w:p>
-            <w:pPr>
-              <w:spacing w:before="60" w:after="60" w:line="240" w:lineRule="auto"/>
-              <w:jc w:val="both"/>
-            </w:pPr>
-            <w:r>
-              <w:t>Có điều kiện</w:t>
-            </w:r>
-          </w:p>
-        </w:tc>
-        <w:tc>
-          <w:tcPr>
-            <w:tcW w:w="979" w:type="dxa"/>
-            <w:shd w:val="clear" w:color="auto" w:fill="auto"/>
-          </w:tcPr>
-          <w:p>
-            <w:pPr>
-              <w:spacing w:before="60" w:after="60" w:line="240" w:lineRule="auto"/>
-              <w:jc w:val="both"/>
-            </w:pPr>
-            <w:r>
-              <w:t>Theo Email VNeID nếu có</w:t>
-            </w:r>
-          </w:p>
-        </w:tc>
-        <w:tc>
-          <w:tcPr>
-            <w:tcW w:w="3773" w:type="dxa"/>
-            <w:shd w:val="clear" w:color="auto" w:fill="auto"/>
-          </w:tcPr>
-          <w:p>
-            <w:pPr>
-              <w:spacing w:before="60" w:after="60" w:line="240" w:lineRule="auto"/>
-              <w:jc w:val="both"/>
-            </w:pPr>
-            <w:r>
-              <w:t>Áp dụng [BR-VAL-002] và [BR-VAL-009].</w:t>
-            </w:r>
-          </w:p>
-        </w:tc>
-      </w:tr>
-      <w:tr>
-        <w:tc>
-          <w:tcPr>
-            <w:tcW w:w="2362" w:type="dxa"/>
-            <w:shd w:val="clear" w:color="auto" w:fill="auto"/>
-          </w:tcPr>
-          <w:p>
-            <w:pPr>
-              <w:spacing w:before="60" w:after="60" w:line="240" w:lineRule="auto"/>
-              <w:jc w:val="both"/>
-            </w:pPr>
-            <w:r>
-              <w:t>Mật khẩu đăng nhập</w:t>
-            </w:r>
-          </w:p>
-        </w:tc>
-        <w:tc>
-          <w:tcPr>
-            <w:tcW w:w="1584" w:type="dxa"/>
-            <w:shd w:val="clear" w:color="auto" w:fill="auto"/>
-          </w:tcPr>
-          <w:p>
-            <w:pPr>
-              <w:spacing w:before="60" w:after="60" w:line="240" w:lineRule="auto"/>
-              <w:jc w:val="both"/>
-            </w:pPr>
-            <w:r>
-              <w:t>Password</w:t>
-            </w:r>
-          </w:p>
-        </w:tc>
-        <w:tc>
-          <w:tcPr>
-            <w:tcW w:w="979" w:type="dxa"/>
-            <w:shd w:val="clear" w:color="auto" w:fill="auto"/>
-          </w:tcPr>
-          <w:p>
-            <w:pPr>
-              <w:spacing w:before="60" w:after="60" w:line="240" w:lineRule="auto"/>
-              <w:jc w:val="both"/>
-            </w:pPr>
-            <w:r>
-              <w:t>Có điều kiện</w:t>
-            </w:r>
-          </w:p>
-        </w:tc>
-        <w:tc>
-          <w:tcPr>
-            <w:tcW w:w="979" w:type="dxa"/>
-            <w:shd w:val="clear" w:color="auto" w:fill="auto"/>
-          </w:tcPr>
-          <w:p>
-            <w:pPr>
-              <w:spacing w:before="60" w:after="60" w:line="240" w:lineRule="auto"/>
-              <w:jc w:val="both"/>
-            </w:pPr>
-            <w:r>
-              <w:t>Trống</w:t>
-            </w:r>
-          </w:p>
-        </w:tc>
-        <w:tc>
-          <w:tcPr>
-            <w:tcW w:w="3773" w:type="dxa"/>
-            <w:shd w:val="clear" w:color="auto" w:fill="auto"/>
-          </w:tcPr>
-          <w:p>
-            <w:pPr>
-              <w:spacing w:before="60" w:after="60" w:line="240" w:lineRule="auto"/>
-              <w:jc w:val="both"/>
-            </w:pPr>
-            <w:r>
-              <w:t>Áp dụng [BR-VAL-006].</w:t>
-            </w:r>
-          </w:p>
-        </w:tc>
-      </w:tr>
-      <w:tr>
-        <w:tc>
-          <w:tcPr>
-            <w:tcW w:w="2362" w:type="dxa"/>
-            <w:shd w:val="clear" w:color="auto" w:fill="auto"/>
-          </w:tcPr>
-          <w:p>
-            <w:pPr>
-              <w:spacing w:before="60" w:after="60" w:line="240" w:lineRule="auto"/>
-              <w:jc w:val="both"/>
-            </w:pPr>
-            <w:r>
-              <w:t>Nhập lại mật khẩu</w:t>
-            </w:r>
-          </w:p>
-        </w:tc>
-        <w:tc>
-          <w:tcPr>
-            <w:tcW w:w="1584" w:type="dxa"/>
-            <w:shd w:val="clear" w:color="auto" w:fill="auto"/>
-          </w:tcPr>
-          <w:p>
-            <w:pPr>
-              <w:spacing w:before="60" w:after="60" w:line="240" w:lineRule="auto"/>
-              <w:jc w:val="both"/>
-            </w:pPr>
-            <w:r>
-              <w:t>Password</w:t>
-            </w:r>
-          </w:p>
-        </w:tc>
-        <w:tc>
-          <w:tcPr>
-            <w:tcW w:w="979" w:type="dxa"/>
-            <w:shd w:val="clear" w:color="auto" w:fill="auto"/>
-          </w:tcPr>
-          <w:p>
-            <w:pPr>
-              <w:spacing w:before="60" w:after="60" w:line="240" w:lineRule="auto"/>
-              <w:jc w:val="both"/>
-            </w:pPr>
-            <w:r>
-              <w:t>Có điều kiện</w:t>
-            </w:r>
-          </w:p>
-        </w:tc>
-        <w:tc>
-          <w:tcPr>
-            <w:tcW w:w="979" w:type="dxa"/>
-            <w:shd w:val="clear" w:color="auto" w:fill="auto"/>
-          </w:tcPr>
-          <w:p>
-            <w:pPr>
-              <w:spacing w:before="60" w:after="60" w:line="240" w:lineRule="auto"/>
-              <w:jc w:val="both"/>
-            </w:pPr>
-            <w:r>
-              <w:t>Trống</w:t>
-            </w:r>
-          </w:p>
-        </w:tc>
-        <w:tc>
-          <w:tcPr>
-            <w:tcW w:w="3773" w:type="dxa"/>
-            <w:shd w:val="clear" w:color="auto" w:fill="auto"/>
-          </w:tcPr>
-          <w:p>
-            <w:pPr>
-              <w:spacing w:before="60" w:after="60" w:line="240" w:lineRule="auto"/>
-              <w:jc w:val="both"/>
-            </w:pPr>
-            <w:r>
-              <w:t>Phải trùng khớp với Mật khẩu đăng nhập.</w:t>
-            </w:r>
-          </w:p>
-        </w:tc>
-      </w:tr>
-      <w:tr>
-        <w:tc>
-          <w:tcPr>
-            <w:tcW w:w="2362" w:type="dxa"/>
-            <w:shd w:val="clear" w:color="auto" w:fill="auto"/>
-          </w:tcPr>
-          <w:p>
-            <w:pPr>
-              <w:spacing w:before="60" w:after="60" w:line="240" w:lineRule="auto"/>
-              <w:jc w:val="both"/>
-            </w:pPr>
-            <w:r>
-              <w:lastRenderedPageBreak/>
-              <w:t>Quốc gia đăng ký</w:t>
-            </w:r>
-          </w:p>
-        </w:tc>
-        <w:tc>
-          <w:tcPr>
-            <w:tcW w:w="1584" w:type="dxa"/>
-            <w:shd w:val="clear" w:color="auto" w:fill="auto"/>
-          </w:tcPr>
-          <w:p>
-            <w:pPr>
-              <w:spacing w:before="60" w:after="60" w:line="240" w:lineRule="auto"/>
-              <w:jc w:val="both"/>
-            </w:pPr>
-            <w:r>
-              <w:t>Enum(String(100))</w:t>
-            </w:r>
-          </w:p>
-        </w:tc>
-        <w:tc>
-          <w:tcPr>
-            <w:tcW w:w="979" w:type="dxa"/>
-            <w:shd w:val="clear" w:color="auto" w:fill="auto"/>
-          </w:tcPr>
-          <w:p>
-            <w:pPr>
-              <w:spacing w:before="60" w:after="60" w:line="240" w:lineRule="auto"/>
-              <w:jc w:val="both"/>
-            </w:pPr>
-            <w:r>
-              <w:t>Có</w:t>
-            </w:r>
-          </w:p>
-        </w:tc>
-        <w:tc>
-          <w:tcPr>
-            <w:tcW w:w="979" w:type="dxa"/>
-            <w:shd w:val="clear" w:color="auto" w:fill="auto"/>
-          </w:tcPr>
-          <w:p>
-            <w:pPr>
-              <w:spacing w:before="60" w:after="60" w:line="240" w:lineRule="auto"/>
-              <w:jc w:val="both"/>
-            </w:pPr>
-            <w:r>
-              <w:t>Lấy từ VNeID</w:t>
-            </w:r>
-          </w:p>
-        </w:tc>
-        <w:tc>
-          <w:tcPr>
-            <w:tcW w:w="3773" w:type="dxa"/>
-            <w:shd w:val="clear" w:color="auto" w:fill="auto"/>
-          </w:tcPr>
-          <w:p>
-            <w:pPr>
-              <w:spacing w:before="60" w:after="60" w:line="240" w:lineRule="auto"/>
-              <w:jc w:val="both"/>
-            </w:pPr>
-            <w:r>
-              <w:t>Control UI: Hộp chọn.</w:t>
-            </w:r>
-          </w:p>
-        </w:tc>
-      </w:tr>
-      <w:tr>
-        <w:tc>
-          <w:tcPr>
-            <w:tcW w:w="2362" w:type="dxa"/>
-            <w:shd w:val="clear" w:color="auto" w:fill="auto"/>
-          </w:tcPr>
-          <w:p>
-            <w:pPr>
-              <w:spacing w:before="60" w:after="60" w:line="240" w:lineRule="auto"/>
-              <w:jc w:val="both"/>
-            </w:pPr>
-            <w:r>
-              <w:t>Phân loại khách hàng</w:t>
-            </w:r>
-          </w:p>
-        </w:tc>
-        <w:tc>
-          <w:tcPr>
-            <w:tcW w:w="1584" w:type="dxa"/>
-            <w:shd w:val="clear" w:color="auto" w:fill="auto"/>
-          </w:tcPr>
-          <w:p>
-            <w:pPr>
-              <w:spacing w:before="60" w:after="60" w:line="240" w:lineRule="auto"/>
-              <w:jc w:val="both"/>
-            </w:pPr>
-            <w:r>
-              <w:t>Enum(String(50))</w:t>
-            </w:r>
-          </w:p>
-        </w:tc>
-        <w:tc>
-          <w:tcPr>
-            <w:tcW w:w="979" w:type="dxa"/>
-            <w:shd w:val="clear" w:color="auto" w:fill="auto"/>
-          </w:tcPr>
-          <w:p>
-            <w:pPr>
-              <w:spacing w:before="60" w:after="60" w:line="240" w:lineRule="auto"/>
-              <w:jc w:val="both"/>
-            </w:pPr>
-            <w:r>
-              <w:t>Có</w:t>
-            </w:r>
-          </w:p>
-        </w:tc>
-        <w:tc>
-          <w:tcPr>
-            <w:tcW w:w="979" w:type="dxa"/>
-            <w:shd w:val="clear" w:color="auto" w:fill="auto"/>
-          </w:tcPr>
-          <w:p>
-            <w:pPr>
-              <w:spacing w:before="60" w:after="60" w:line="240" w:lineRule="auto"/>
-              <w:jc w:val="both"/>
-            </w:pPr>
-            <w:r>
-              <w:t>Theo Quốc gia đăng ký</w:t>
-            </w:r>
-          </w:p>
-        </w:tc>
-        <w:tc>
-          <w:tcPr>
-            <w:tcW w:w="3773" w:type="dxa"/>
-            <w:shd w:val="clear" w:color="auto" w:fill="auto"/>
-          </w:tcPr>
-          <w:p>
-            <w:pPr>
-              <w:spacing w:before="60" w:after="60" w:line="240" w:lineRule="auto"/>
-              <w:jc w:val="both"/>
-            </w:pPr>
-            <w:r>
-              <w:t>Gồm Trong nước hoặc Nước ngoài.</w:t>
-            </w:r>
-          </w:p>
-        </w:tc>
-      </w:tr>
-      <w:tr>
-        <w:tc>
-          <w:tcPr>
-            <w:tcW w:w="2362" w:type="dxa"/>
-            <w:shd w:val="clear" w:color="auto" w:fill="auto"/>
-          </w:tcPr>
-          <w:p>
-            <w:pPr>
-              <w:spacing w:before="60" w:after="60" w:line="240" w:lineRule="auto"/>
-              <w:jc w:val="both"/>
-            </w:pPr>
-            <w:r>
               <w:t>Tỉnh/Thành phố</w:t>
             </w:r>
           </w:p>
@@ -6207,11 +6108,7 @@
               <w:jc w:val="both"/>
             </w:pPr>
             <w:r>
-              <w:t xml:space="preserve">Chọn/Bỏ chọn Tài khoản đăng ký / Tài </w:t>
-            </w:r>
-            <w:r>
-              <w:lastRenderedPageBreak/>
-              <w:t>khoản tra cứu</w:t>
+              <w:t>Chọn/Bỏ chọn Tài khoản đăng ký / Tài khoản tra cứu</w:t>
             </w:r>
           </w:p>
         </w:tc>
@@ -6226,7 +6123,6 @@
               <w:jc w:val="both"/>
             </w:pPr>
             <w:r>
-              <w:lastRenderedPageBreak/>
               <w:t>Checkbox</w:t>
             </w:r>
           </w:p>
@@ -6387,7 +6283,11 @@
               <w:t>[BR-VAL-001]</w:t>
             </w:r>
             <w:r>
-              <w:t xml:space="preserve">, hệ thống focus và highlight viền đỏ ô trống đầu tiên, hiển thị cảnh báo lỗi </w:t>
+              <w:t xml:space="preserve">, hệ thống focus và </w:t>
+            </w:r>
+            <w:r>
+              <w:lastRenderedPageBreak/>
+              <w:t xml:space="preserve">highlight viền đỏ ô trống đầu tiên, hiển thị cảnh báo lỗi </w:t>
             </w:r>
             <w:r>
               <w:rPr>
@@ -6543,23 +6443,10 @@
               <w:rPr>
                 <w:bCs/>
               </w:rPr>
-              <w:t>TH7 (VNeID không trả về đủ thông tin tổ chức được đại diện)</w:t>
-            </w:r>
-            <w:r>
-              <w:t xml:space="preserve">: Nếu ngữ cảnh là Đại diện tổ chức nhưng dữ liệu VNeID không </w:t>
-            </w:r>
-            <w:r>
-              <w:lastRenderedPageBreak/>
-              <w:t xml:space="preserve">có đủ thông tin định danh tối thiểu của tổ chức, hệ thống hiển thị thông báo lỗi </w:t>
-            </w:r>
-            <w:r>
-              <w:rPr>
-                <w:bCs/>
-              </w:rPr>
-              <w:t>[MSG-ERR-UC001-013]</w:t>
-            </w:r>
-            <w:r>
-              <w:t>.</w:t>
+              <w:t>TH7 (Đăng ký thành công - Chỉ chọn Tài khoản đăng ký)</w:t>
+            </w:r>
+            <w:r>
+              <w:t>: Hệ thống tạo/liên kết hồ sơ tài khoản khách hàng với nguồn xác thực VNeID (và nguồn xác thực Nội bộ nếu có chọn), khởi tạo phiên đăng nhập và chuyển hướng về Trang chủ.</w:t>
             </w:r>
             <w:r>
               <w:br/>
@@ -6569,23 +6456,14 @@
               <w:rPr>
                 <w:bCs/>
               </w:rPr>
-              <w:t>TH8 (Đăng ký thành công - Chỉ chọn Tài khoản đăng ký)</w:t>
-            </w:r>
-            <w:r>
-              <w:t>: Hệ thống tạo/liên kết hồ sơ tài khoản khách hàng với nguồn xác thực VNeID (và nguồn xác thực Nội bộ nếu có chọn), khởi tạo phiên đăng nhập và chuyển hướng về Trang chủ.</w:t>
-            </w:r>
-            <w:r>
-              <w:br/>
-              <w:t xml:space="preserve">- </w:t>
-            </w:r>
-            <w:r>
-              <w:rPr>
-                <w:bCs/>
-              </w:rPr>
-              <w:t>TH9 (Đăng ký thành công - Có chọn Tài khoản tra cứu)</w:t>
-            </w:r>
-            <w:r>
-              <w:t>: Hệ thống tạo/liên kết hồ sơ tài khoản khách hàng theo TH8, đồng thời khởi tạo Yêu cầu cấp mã số sử dụng CSDL loại Thường xuyên theo đúng quy định và chuyển hướng người dùng sang Cổng thanh toán.</w:t>
+              <w:t>TH8 (Đăng ký thành công - Có chọn Tài khoản tra cứu)</w:t>
+            </w:r>
+            <w:r>
+              <w:t xml:space="preserve">: Hệ thống tạo/liên kết hồ sơ tài khoản khách hàng theo TH7, đồng thời khởi tạo Yêu cầu cấp mã số sử dụng CSDL loại Thường xuyên theo đúng quy định và chuyển hướng người dùng sang Cổng thanh </w:t>
+            </w:r>
+            <w:r>
+              <w:lastRenderedPageBreak/>
+              <w:t>toán. (Check hỏi lại thêm với khách hàng xem có cần thiết bắt buộc phải thanh toán luôn không? Hay chỉ liên quan tới việc Tạo quyền trên hệ thống)</w:t>
             </w:r>
           </w:p>
         </w:tc>
@@ -6690,7 +6568,6 @@
         <w:rPr>
           <w:rFonts w:cs="Times New Roman"/>
         </w:rPr>
-        <w:lastRenderedPageBreak/>
         <w:t>4.1.5.5. MH04 - Màn hình Đổi mật khẩu lần đầu / Mật khẩu hết hạn</w:t>
       </w:r>
     </w:p>
@@ -6783,6 +6660,7 @@
         <w:rPr>
           <w:rFonts w:cs="Times New Roman"/>
         </w:rPr>
+        <w:lastRenderedPageBreak/>
         <w:t>4.1.5.5.2. Mô tả thông tin trên màn hình</w:t>
       </w:r>
     </w:p>
@@ -6929,9 +6807,6 @@
               <w:jc w:val="both"/>
             </w:pPr>
             <w:r>
-              <w:rPr>
-                <w:bCs/>
-              </w:rPr>
               <w:t>Mật khẩu hiện tại</w:t>
             </w:r>
           </w:p>
@@ -7009,9 +6884,6 @@
               <w:jc w:val="both"/>
             </w:pPr>
             <w:r>
-              <w:rPr>
-                <w:bCs/>
-              </w:rPr>
               <w:t>Mật khẩu mới</w:t>
             </w:r>
           </w:p>
@@ -7089,9 +6961,6 @@
               <w:jc w:val="both"/>
             </w:pPr>
             <w:r>
-              <w:rPr>
-                <w:bCs/>
-              </w:rPr>
               <w:t>Xác nhận mật khẩu mới</w:t>
             </w:r>
           </w:p>
@@ -7172,7 +7041,6 @@
         <w:rPr>
           <w:rFonts w:cs="Times New Roman"/>
         </w:rPr>
-        <w:lastRenderedPageBreak/>
         <w:t>4.1.5.5.3. Chức năng trên màn hình</w:t>
       </w:r>
     </w:p>
@@ -7513,7 +7381,11 @@
               <w:t>TH Hợp lệ (Lưu mật khẩu thành công)</w:t>
             </w:r>
             <w:r>
-              <w:t xml:space="preserve">: Hệ thống mã hóa băm mật khẩu mới (Hash + Salt) lưu CSDL, tắt cờ bắt buộc đổi mật khẩu (ForcePasswordChange = false), cập nhật ngày đổi mật khẩu gần nhất, ghi nhận nhật ký (Audit Log), hiển thị thông báo thành công </w:t>
+              <w:t xml:space="preserve">: Hệ thống mã hóa băm mật khẩu mới (Hash + </w:t>
+            </w:r>
+            <w:r>
+              <w:lastRenderedPageBreak/>
+              <w:t xml:space="preserve">Salt) lưu CSDL, tắt cờ bắt buộc đổi mật khẩu (ForcePasswordChange = false), cập nhật ngày đổi mật khẩu gần nhất, ghi nhận nhật ký (Audit Log), hiển thị thông báo thành công </w:t>
             </w:r>
             <w:r>
               <w:rPr>
@@ -7539,6 +7411,7 @@
               <w:jc w:val="center"/>
             </w:pPr>
             <w:r>
+              <w:lastRenderedPageBreak/>
               <w:t>2</w:t>
             </w:r>
           </w:p>
@@ -7626,7 +7499,6 @@
         <w:rPr>
           <w:rFonts w:cs="Times New Roman"/>
         </w:rPr>
-        <w:lastRenderedPageBreak/>
         <w:t>4.1.5.6. MH05 - Màn hình Xác thực OTP qua Email (MFA)</w:t>
       </w:r>
     </w:p>
@@ -7948,6 +7820,7 @@
               <w:rPr>
                 <w:bCs/>
               </w:rPr>
+              <w:lastRenderedPageBreak/>
               <w:t>Bộ đếm ngược thời gian</w:t>
             </w:r>
           </w:p>
@@ -8222,11 +8095,7 @@
               <w:t>TH2 (Sai định dạng mã OTP)</w:t>
             </w:r>
             <w:r>
-              <w:t xml:space="preserve">: Nếu mã OTP không đủ 6 chữ số hoặc chứa ký tự </w:t>
-            </w:r>
-            <w:r>
-              <w:lastRenderedPageBreak/>
-              <w:t>khác số, hiển thị thông báo lỗi [MSG-ERR-SEC-004].</w:t>
+              <w:t>: Nếu mã OTP không đủ 6 chữ số hoặc chứa ký tự khác số, hiển thị thông báo lỗi [MSG-ERR-SEC-004].</w:t>
             </w:r>
             <w:r>
               <w:br/>
@@ -8300,7 +8169,6 @@
               <w:jc w:val="center"/>
             </w:pPr>
             <w:r>
-              <w:lastRenderedPageBreak/>
               <w:t>2</w:t>
             </w:r>
           </w:p>
@@ -8498,7 +8366,7 @@
   <w:abstractNum w:abstractNumId="0" w15:restartNumberingAfterBreak="0">
     <w:nsid w:val="0000A990"/>
     <w:multiLevelType w:val="multilevel"/>
-    <w:tmpl w:val="214E34D0"/>
+    <w:tmpl w:val="256AA27C"/>
     <w:lvl w:ilvl="0">
       <w:numFmt w:val="bullet"/>
       <w:lvlText w:val=" "/>
@@ -8575,7 +8443,7 @@
   <w:abstractNum w:abstractNumId="1" w15:restartNumberingAfterBreak="0">
     <w:nsid w:val="0000A991"/>
     <w:multiLevelType w:val="multilevel"/>
-    <w:tmpl w:val="63D42920"/>
+    <w:tmpl w:val="F926EEF8"/>
     <w:lvl w:ilvl="0">
       <w:numFmt w:val="bullet"/>
       <w:lvlText w:val="•"/>
@@ -11129,7 +10997,7 @@
   <w:abstractNum w:abstractNumId="27" w15:restartNumberingAfterBreak="0">
     <w:nsid w:val="75033419"/>
     <w:multiLevelType w:val="multilevel"/>
-    <w:tmpl w:val="C8841AB2"/>
+    <w:tmpl w:val="049C4E36"/>
     <w:lvl w:ilvl="0">
       <w:start w:val="1"/>
       <w:numFmt w:val="decimal"/>

</xml_diff>